<commit_message>
Replace academic CV with latest user-provided versions
</commit_message>
<xml_diff>
--- a/Peixuan_Yang_Academic_CV.docx
+++ b/Peixuan_Yang_Academic_CV.docx
@@ -4,1399 +4,1566 @@
   <w:body>
     <w:p>
       <w:pPr>
-        <w:keepNext/>
-        <w:keepLines/>
-        <w:spacing w:after="10"/>
-        <w:jc w:val="center"/>
-        <w:widowControl/>
-      </w:pPr>
-      <w:r>
-        <w:rPr>
-          <w:rFonts w:ascii="Times New Roman" w:hAnsi="Times New Roman" w:eastAsia="Times New Roman"/>
-          <w:b/>
-          <w:i w:val="0"/>
-          <w:color w:val="252525"/>
-          <w:sz w:val="40"/>
-        </w:rPr>
-        <w:t>Peixuan Yang</w:t>
-      </w:r>
-    </w:p>
-    <w:p>
-      <w:pPr>
-        <w:keepNext/>
-        <w:keepLines/>
-        <w:spacing w:after="8"/>
-        <w:jc w:val="center"/>
-        <w:widowControl/>
-      </w:pPr>
-      <w:r>
-        <w:rPr>
-          <w:rFonts w:ascii="Times New Roman" w:hAnsi="Times New Roman" w:eastAsia="Times New Roman"/>
-          <w:b w:val="0"/>
-          <w:i/>
-          <w:color w:val="4E4E4E"/>
-          <w:sz w:val="20"/>
-        </w:rPr>
-        <w:t>Incoming BEng (Hons) Student in Computer Science and Electronic Engineering</w:t>
-      </w:r>
-    </w:p>
-    <w:p>
-      <w:pPr>
-        <w:spacing w:after="30"/>
-        <w:jc w:val="center"/>
-        <w:keepNext/>
-        <w:keepLines/>
+        <w:shd w:val="clear" w:fill="auto"/>
+        <w:spacing w:after="65" w:line="247" w:lineRule="auto" w:before="0" w:beforeAutospacing="0" w:afterAutospacing="0"/>
+        <w:jc w:val="left"/>
+        <w:widowControl w:val="1"/>
+        <w:keepLines w:val="1"/>
+      </w:pPr>
+      <w:r>
+        <w:rPr>
+          <w:rFonts w:ascii="Times New Roman" w:hAnsi="Times New Roman" w:cs="Times New Roman"/>
+          <w:b w:val="1"/>
+          <w:i w:val="0"/>
+          <w:color w:val="1F1F1F"/>
+          <w:sz w:val="36"/>
+          <w:szCs w:val="36"/>
+        </w:rPr>
+        <w:t xml:space="preserve">Peixuan Yang</w:t>
+      </w:r>
+    </w:p>
+    <w:p>
+      <w:pPr>
+        <w:shd w:val="clear" w:fill="auto"/>
+        <w:spacing w:after="50" w:line="247" w:lineRule="auto" w:before="0" w:beforeAutospacing="0" w:afterAutospacing="0"/>
+        <w:jc w:val="left"/>
+        <w:widowControl w:val="1"/>
+        <w:keepNext w:val="1"/>
+        <w:keepLines w:val="1"/>
+      </w:pPr>
+      <w:r>
+        <w:rPr>
+          <w:rFonts w:ascii="Times New Roman" w:hAnsi="Times New Roman" w:cs="Times New Roman"/>
+          <w:b w:val="0"/>
+          <w:i w:val="1"/>
+          <w:color w:val="1F1F1F"/>
+          <w:sz w:val="21"/>
+          <w:szCs w:val="21"/>
+        </w:rPr>
+        <w:t xml:space="preserve">Incoming Year 2 BEng (Hons) · Computer Science and Electronic Engineering</w:t>
+      </w:r>
+    </w:p>
+    <w:p>
+      <w:pPr>
+        <w:shd w:val="clear" w:fill="auto"/>
+        <w:spacing w:after="45" w:line="247" w:lineRule="auto" w:before="0" w:beforeAutospacing="0" w:afterAutospacing="0"/>
+        <w:jc w:val="left"/>
+        <w:widowControl w:val="1"/>
+        <w:keepLines w:val="1"/>
+      </w:pPr>
+      <w:r>
+        <w:rPr>
+          <w:rFonts w:ascii="Times New Roman" w:hAnsi="Times New Roman" w:cs="Times New Roman"/>
+          <w:b w:val="0"/>
+          <w:i w:val="0"/>
+          <w:color w:val="1F1F1F"/>
+          <w:sz w:val="21"/>
+          <w:szCs w:val="21"/>
+        </w:rPr>
+        <w:t xml:space="preserve">sgpyang2@liverpool.ac.uk | +44 7902 052947 | github.com/sh1ranY</w:t>
+      </w:r>
+    </w:p>
+    <w:p>
+      <w:pPr>
+        <w:shd w:val="clear" w:fill="auto"/>
+        <w:spacing w:after="45" w:line="247" w:lineRule="auto" w:before="0" w:beforeAutospacing="0" w:afterAutospacing="0"/>
+        <w:jc w:val="left"/>
+        <w:widowControl w:val="1"/>
+        <w:keepLines w:val="1"/>
+      </w:pPr>
+      <w:r>
+        <w:rPr>
+          <w:rFonts w:ascii="Times New Roman" w:hAnsi="Times New Roman" w:cs="Times New Roman"/>
+          <w:b w:val="0"/>
+          <w:i w:val="0"/>
+          <w:color w:val="1F1F1F"/>
+          <w:sz w:val="22"/>
+          <w:szCs w:val="22"/>
+        </w:rPr>
+        <w:t xml:space="preserve"/>
+      </w:r>
+      <w:r>
+        <w:rPr>
+          <w:rFonts w:ascii="Times New Roman" w:hAnsi="Times New Roman" w:cs="Times New Roman"/>
+          <w:b w:val="1"/>
+          <w:i w:val="0"/>
+          <w:color w:val="1F1F1F"/>
+          <w:sz w:val="22"/>
+          <w:szCs w:val="22"/>
+        </w:rPr>
+        <w:t xml:space="preserve">Research interests  </w:t>
+      </w:r>
+      <w:r>
+        <w:rPr>
+          <w:rFonts w:ascii="Times New Roman" w:hAnsi="Times New Roman" w:cs="Times New Roman"/>
+          <w:b w:val="0"/>
+          <w:i w:val="0"/>
+          <w:color w:val="1F1F1F"/>
+          <w:sz w:val="22"/>
+          <w:szCs w:val="22"/>
+        </w:rPr>
+        <w:t xml:space="preserve">AI hardware–world-model co-design; photonic computing and computer architecture; efficient generative inference; trustworthy autonomous and multi-robot systems.</w:t>
+      </w:r>
+    </w:p>
+    <w:p>
+      <w:pPr>
+        <w:pStyle w:val="3"/>
+        <w:shd w:val="clear" w:fill="auto"/>
+        <w:spacing w:before="120" w:after="65" w:line="247" w:lineRule="auto" w:beforeAutospacing="0" w:afterAutospacing="0"/>
+        <w:jc w:val="left"/>
+        <w:widowControl w:val="1"/>
+        <w:keepNext w:val="1"/>
+        <w:keepLines w:val="1"/>
         <w:pBdr>
-          <w:bottom w:val="single" w:sz="5" w:space="2" w:color="6F7780"/>
+          <w:top w:val="single" w:sz="8" w:space="5" w:color="A0A0A0"/>
         </w:pBdr>
-        <w:widowControl/>
-      </w:pPr>
-      <w:r>
-        <w:rPr>
-          <w:rFonts w:ascii="Times New Roman" w:hAnsi="Times New Roman" w:eastAsia="Times New Roman"/>
-          <w:b w:val="0"/>
-          <w:i w:val="0"/>
-          <w:color w:val="252525"/>
-          <w:sz w:val="19"/>
-        </w:rPr>
-        <w:t>Suzhou, China; relocating to Liverpool, UK (Sep 2026) | +86 189 4294 3381 | Peixuan.Yang24@student.xjtlu.edu.cn</w:t>
-      </w:r>
-    </w:p>
-    <w:p>
-      <w:pPr>
-        <w:keepNext w:val="0"/>
-        <w:keepLines w:val="0"/>
-        <w:spacing w:before="0" w:after="34" w:line="252" w:lineRule="auto"/>
-        <w:widowControl/>
-      </w:pPr>
-      <w:r>
-        <w:rPr>
-          <w:rFonts w:ascii="Times New Roman" w:hAnsi="Times New Roman" w:eastAsia="Times New Roman"/>
-          <w:b/>
-          <w:i w:val="0"/>
-          <w:color w:val="252525"/>
-          <w:sz w:val="19"/>
-        </w:rPr>
-        <w:t xml:space="preserve">Research Interests: </w:t>
-      </w:r>
-      <w:r>
-        <w:rPr>
-          <w:rFonts w:ascii="Times New Roman" w:hAnsi="Times New Roman" w:eastAsia="Times New Roman"/>
-          <w:b w:val="0"/>
-          <w:i w:val="0"/>
-          <w:color w:val="252525"/>
-          <w:sz w:val="19"/>
-        </w:rPr>
-        <w:t>AI hardware-world-model co-design; photonic computing and computer architecture; efficient generative inference; trustworthy autonomous and multi-robot systems.</w:t>
+      </w:pPr>
+      <w:r>
+        <w:rPr>
+          <w:rFonts w:ascii="Times New Roman" w:hAnsi="Times New Roman" w:cs="Times New Roman"/>
+          <w:b w:val="1"/>
+          <w:i w:val="0"/>
+          <w:color w:val="1F1F1F"/>
+          <w:sz w:val="28"/>
+          <w:szCs w:val="28"/>
+        </w:rPr>
+        <w:t xml:space="preserve">EDUCATION</w:t>
+      </w:r>
+    </w:p>
+    <w:p>
+      <w:pPr>
+        <w:shd w:val="clear" w:fill="auto"/>
+        <w:spacing w:after="30" w:line="247" w:lineRule="auto" w:before="70" w:beforeAutospacing="0" w:afterAutospacing="0"/>
+        <w:jc w:val="left"/>
+        <w:widowControl w:val="1"/>
+        <w:keepNext w:val="1"/>
+        <w:keepLines w:val="1"/>
+      </w:pPr>
+      <w:r>
+        <w:rPr>
+          <w:rFonts w:ascii="Times New Roman" w:hAnsi="Times New Roman" w:cs="Times New Roman"/>
+          <w:b w:val="1"/>
+          <w:i w:val="0"/>
+          <w:color w:val="1F1F1F"/>
+          <w:sz w:val="22"/>
+          <w:szCs w:val="22"/>
+        </w:rPr>
+        <w:t xml:space="preserve">University of Liverpool</w:t>
+      </w:r>
+    </w:p>
+    <w:p>
+      <w:pPr>
+        <w:shd w:val="clear" w:fill="auto"/>
+        <w:spacing w:after="50" w:line="247" w:lineRule="auto" w:before="0" w:beforeAutospacing="0" w:afterAutospacing="0"/>
+        <w:jc w:val="left"/>
+        <w:widowControl w:val="1"/>
+        <w:keepNext w:val="1"/>
+        <w:keepLines w:val="1"/>
+      </w:pPr>
+      <w:r>
+        <w:rPr>
+          <w:rFonts w:ascii="Times New Roman" w:hAnsi="Times New Roman" w:cs="Times New Roman"/>
+          <w:b w:val="0"/>
+          <w:i w:val="1"/>
+          <w:color w:val="1F1F1F"/>
+          <w:sz w:val="21"/>
+          <w:szCs w:val="21"/>
+        </w:rPr>
+        <w:t xml:space="preserve">BEng (Hons), Computer Science and Electronic Engineering</w:t>
+      </w:r>
+      <w:r>
+        <w:rPr>
+          <w:rFonts w:ascii="Times New Roman" w:hAnsi="Times New Roman" w:cs="Times New Roman"/>
+          <w:b w:val="0"/>
+          <w:i w:val="0"/>
+          <w:color w:val="1F1F1F"/>
+          <w:sz w:val="21"/>
+          <w:szCs w:val="21"/>
+        </w:rPr>
+        <w:t xml:space="preserve"> | Sep 2026 – Jun 2028 (expected)</w:t>
+      </w:r>
+    </w:p>
+    <w:p>
+      <w:pPr>
+        <w:shd w:val="clear" w:fill="auto"/>
+        <w:spacing w:after="45" w:line="247" w:lineRule="auto" w:before="0" w:beforeAutospacing="0" w:afterAutospacing="0"/>
+        <w:jc w:val="left"/>
+        <w:widowControl w:val="1"/>
+        <w:keepLines w:val="1"/>
+      </w:pPr>
+      <w:r>
+        <w:rPr>
+          <w:rFonts w:ascii="Times New Roman" w:hAnsi="Times New Roman" w:cs="Times New Roman"/>
+          <w:b w:val="0"/>
+          <w:i w:val="0"/>
+          <w:color w:val="1F1F1F"/>
+          <w:sz w:val="22"/>
+          <w:szCs w:val="22"/>
+        </w:rPr>
+        <w:t xml:space="preserve">XJTLU 2+2 pathway; Years 2–3 at Liverpool.</w:t>
+      </w:r>
+    </w:p>
+    <w:p>
+      <w:pPr>
+        <w:shd w:val="clear" w:fill="auto"/>
+        <w:spacing w:after="30" w:line="247" w:lineRule="auto" w:before="70" w:beforeAutospacing="0" w:afterAutospacing="0"/>
+        <w:jc w:val="left"/>
+        <w:widowControl w:val="1"/>
+        <w:keepNext w:val="1"/>
+        <w:keepLines w:val="1"/>
+      </w:pPr>
+      <w:r>
+        <w:rPr>
+          <w:rFonts w:ascii="Times New Roman" w:hAnsi="Times New Roman" w:cs="Times New Roman"/>
+          <w:b w:val="1"/>
+          <w:i w:val="0"/>
+          <w:color w:val="1F1F1F"/>
+          <w:sz w:val="22"/>
+          <w:szCs w:val="22"/>
+        </w:rPr>
+        <w:t xml:space="preserve">Xi’an Jiaotong-Liverpool University</w:t>
+      </w:r>
+    </w:p>
+    <w:p>
+      <w:pPr>
+        <w:shd w:val="clear" w:fill="auto"/>
+        <w:spacing w:after="50" w:line="247" w:lineRule="auto" w:before="0" w:beforeAutospacing="0" w:afterAutospacing="0"/>
+        <w:jc w:val="left"/>
+        <w:widowControl w:val="1"/>
+        <w:keepNext w:val="1"/>
+        <w:keepLines w:val="1"/>
+      </w:pPr>
+      <w:r>
+        <w:rPr>
+          <w:rFonts w:ascii="Times New Roman" w:hAnsi="Times New Roman" w:cs="Times New Roman"/>
+          <w:b w:val="0"/>
+          <w:i w:val="1"/>
+          <w:color w:val="1F1F1F"/>
+          <w:sz w:val="21"/>
+          <w:szCs w:val="21"/>
+        </w:rPr>
+        <w:t xml:space="preserve">Computer Science and Technology · Suzhou, China</w:t>
+      </w:r>
+      <w:r>
+        <w:rPr>
+          <w:rFonts w:ascii="Times New Roman" w:hAnsi="Times New Roman" w:cs="Times New Roman"/>
+          <w:b w:val="0"/>
+          <w:i w:val="0"/>
+          <w:color w:val="1F1F1F"/>
+          <w:sz w:val="21"/>
+          <w:szCs w:val="21"/>
+        </w:rPr>
+        <w:t xml:space="preserve"> | Sep 2024 – Jul 2026</w:t>
+      </w:r>
+    </w:p>
+    <w:p>
+      <w:pPr>
+        <w:shd w:val="clear" w:fill="auto"/>
+        <w:spacing w:after="45" w:line="247" w:lineRule="auto" w:before="0" w:beforeAutospacing="0" w:afterAutospacing="0"/>
+        <w:jc w:val="left"/>
+        <w:widowControl w:val="1"/>
+        <w:keepLines w:val="1"/>
+      </w:pPr>
+      <w:r>
+        <w:rPr>
+          <w:rFonts w:ascii="Times New Roman" w:hAnsi="Times New Roman" w:cs="Times New Roman"/>
+          <w:b w:val="0"/>
+          <w:i w:val="0"/>
+          <w:color w:val="1F1F1F"/>
+          <w:sz w:val="22"/>
+          <w:szCs w:val="22"/>
+        </w:rPr>
+        <w:t xml:space="preserve">University of Liverpool International Education Programme.</w:t>
+      </w:r>
+    </w:p>
+    <w:p>
+      <w:pPr>
+        <w:numPr>
+          <w:ilvl w:val="0"/>
+          <w:numId w:val="3"/>
+        </w:numPr>
+        <w:shd w:val="clear" w:fill="auto"/>
+        <w:spacing w:before="0" w:beforeAutospacing="0" w:after="40" w:afterAutospacing="0" w:line="247" w:lineRule="auto"/>
+        <w:ind w:left="465" w:hanging="360"/>
+        <w:jc w:val="left"/>
+        <w:widowControl w:val="1"/>
+        <w:keepLines w:val="1"/>
+      </w:pPr>
+      <w:r>
+        <w:rPr>
+          <w:rFonts w:ascii="Times New Roman" w:hAnsi="Times New Roman" w:cs="Times New Roman"/>
+          <w:b w:val="0"/>
+          <w:i w:val="0"/>
+          <w:color w:val="1F1F1F"/>
+          <w:sz w:val="22"/>
+          <w:szCs w:val="22"/>
+        </w:rPr>
+        <w:t xml:space="preserve">2025/26 weighted average: 71% (First-Class level). Selected marks: Computer Systems 88%; Engineering Mathematics II 86%; Digital Electronics I 76%; Data Structures and Algorithms 76%.</w:t>
       </w:r>
     </w:p>
     <w:p>
       <w:pPr>
         <w:pStyle w:val="3"/>
-        <w:keepNext/>
-        <w:keepLines/>
-        <w:pageBreakBefore w:val="0"/>
+        <w:shd w:val="clear" w:fill="auto"/>
+        <w:spacing w:before="120" w:after="65" w:line="247" w:lineRule="auto" w:beforeAutospacing="0" w:afterAutospacing="0"/>
+        <w:jc w:val="left"/>
+        <w:widowControl w:val="1"/>
+        <w:keepNext w:val="1"/>
+        <w:keepLines w:val="1"/>
         <w:pBdr>
-          <w:bottom w:val="single" w:sz="5" w:space="2" w:color="6F7780"/>
+          <w:top w:val="single" w:sz="8" w:space="5" w:color="A0A0A0"/>
         </w:pBdr>
-        <w:widowControl/>
-      </w:pPr>
-      <w:r>
-        <w:t>EDUCATION</w:t>
-      </w:r>
-    </w:p>
-    <w:p>
-      <w:pPr>
-        <w:keepNext/>
-        <w:keepLines/>
-        <w:spacing w:before="24" w:after="2" w:line="240" w:lineRule="auto"/>
-        <w:widowControl/>
-      </w:pPr>
-      <w:r>
-        <w:rPr>
-          <w:rFonts w:ascii="Times New Roman" w:hAnsi="Times New Roman" w:eastAsia="Times New Roman"/>
-          <w:b/>
-          <w:i w:val="0"/>
-          <w:color w:val="252525"/>
+      </w:pPr>
+      <w:r>
+        <w:rPr>
+          <w:rFonts w:ascii="Times New Roman" w:hAnsi="Times New Roman" w:cs="Times New Roman"/>
+          <w:b w:val="1"/>
+          <w:i w:val="0"/>
+          <w:color w:val="1F1F1F"/>
+          <w:sz w:val="28"/>
+          <w:szCs w:val="28"/>
+        </w:rPr>
+        <w:t xml:space="preserve">SELECTED PUBLICATION</w:t>
+      </w:r>
+    </w:p>
+    <w:p>
+      <w:pPr>
+        <w:shd w:val="clear" w:fill="auto"/>
+        <w:spacing w:after="45" w:line="247" w:lineRule="auto" w:before="0" w:beforeAutospacing="0" w:afterAutospacing="0"/>
+        <w:jc w:val="left"/>
+        <w:widowControl w:val="1"/>
+        <w:keepLines w:val="1"/>
+      </w:pPr>
+      <w:r>
+        <w:rPr>
+          <w:rFonts w:ascii="Times New Roman" w:hAnsi="Times New Roman" w:cs="Times New Roman"/>
+          <w:b w:val="0"/>
+          <w:i w:val="0"/>
+          <w:color w:val="1F1F1F"/>
+          <w:sz w:val="22"/>
+          <w:szCs w:val="22"/>
+        </w:rPr>
+        <w:t xml:space="preserve">Y. Wang, Y. Gao, </w:t>
+      </w:r>
+      <w:r>
+        <w:rPr>
+          <w:rFonts w:ascii="Times New Roman" w:hAnsi="Times New Roman" w:cs="Times New Roman"/>
+          <w:b w:val="1"/>
+          <w:i w:val="0"/>
+          <w:color w:val="1F1F1F"/>
+          <w:sz w:val="22"/>
+          <w:szCs w:val="22"/>
+        </w:rPr>
+        <w:t xml:space="preserve">P. Yang</w:t>
+      </w:r>
+      <w:r>
+        <w:rPr>
+          <w:rFonts w:ascii="Times New Roman" w:hAnsi="Times New Roman" w:cs="Times New Roman"/>
+          <w:b w:val="0"/>
+          <w:i w:val="0"/>
+          <w:color w:val="1F1F1F"/>
+          <w:sz w:val="22"/>
+          <w:szCs w:val="22"/>
+        </w:rPr>
+        <w:t xml:space="preserve">, and B. Zhao. “Optimized Fine-tuning and Pseudo-Data Strategies for Cross-Domain Low-Resource Language Cantonese-English Neural Machine Translation.” 11th International Conference on Robotics and Artificial Intelligence (ICRAI), Nagoya, Japan, 2025.</w:t>
+      </w:r>
+    </w:p>
+    <w:p>
+      <w:pPr>
+        <w:shd w:val="clear" w:fill="auto"/>
+        <w:spacing w:after="50" w:line="247" w:lineRule="auto" w:before="0" w:beforeAutospacing="0" w:afterAutospacing="0"/>
+        <w:jc w:val="left"/>
+        <w:widowControl w:val="1"/>
+        <w:keepNext w:val="1"/>
+        <w:keepLines w:val="1"/>
+      </w:pPr>
+      <w:r>
+        <w:rPr>
+          <w:rFonts w:ascii="Times New Roman" w:hAnsi="Times New Roman" w:cs="Times New Roman"/>
+          <w:b w:val="0"/>
+          <w:i w:val="1"/>
+          <w:color w:val="1F1F1F"/>
           <w:sz w:val="21"/>
-        </w:rPr>
-        <w:t>University of Liverpool | Liverpool, United Kingdom</w:t>
-      </w:r>
-      <w:r>
-        <w:rPr>
-          <w:rFonts w:ascii="Times New Roman" w:hAnsi="Times New Roman" w:eastAsia="Times New Roman"/>
-          <w:b/>
-          <w:i w:val="0"/>
-          <w:color w:val="4E4E4E"/>
-          <w:sz w:val="20"/>
-        </w:rPr>
-        <w:t xml:space="preserve"> | Sep 2026 - Jun 2028 (expected)</w:t>
-      </w:r>
-    </w:p>
-    <w:p>
-      <w:pPr>
-        <w:pStyle w:val="CVRole"/>
-        <w:keepNext/>
-        <w:keepLines/>
-        <w:spacing w:line="240" w:lineRule="auto"/>
-        <w:widowControl/>
-      </w:pPr>
-      <w:r>
-        <w:rPr>
-          <w:rFonts w:ascii="Times New Roman" w:hAnsi="Times New Roman" w:eastAsia="Times New Roman"/>
-          <w:b w:val="0"/>
-          <w:i/>
-          <w:color w:val="4E4E4E"/>
-          <w:sz w:val="20"/>
-        </w:rPr>
-        <w:t>BEng (Hons), Computer Science and Electronic Engineering (Years 2-3 in Liverpool)</w:t>
-      </w:r>
-    </w:p>
-    <w:p>
-      <w:pPr>
-        <w:keepNext/>
-        <w:keepLines/>
-        <w:spacing w:before="24" w:after="2" w:line="240" w:lineRule="auto"/>
-        <w:widowControl/>
-      </w:pPr>
-      <w:r>
-        <w:rPr>
-          <w:rFonts w:ascii="Times New Roman" w:hAnsi="Times New Roman" w:eastAsia="Times New Roman"/>
-          <w:b/>
-          <w:i w:val="0"/>
-          <w:color w:val="252525"/>
+          <w:szCs w:val="21"/>
+        </w:rPr>
+        <w:t xml:space="preserve">Co-second author and presenter. Best Presentation Award.</w:t>
+      </w:r>
+    </w:p>
+    <w:p>
+      <w:pPr>
+        <w:pStyle w:val="3"/>
+        <w:shd w:val="clear" w:fill="auto"/>
+        <w:spacing w:before="120" w:after="65" w:line="247" w:lineRule="auto" w:beforeAutospacing="0" w:afterAutospacing="0"/>
+        <w:jc w:val="left"/>
+        <w:widowControl w:val="1"/>
+        <w:keepNext w:val="1"/>
+        <w:keepLines w:val="1"/>
+        <w:pBdr>
+          <w:top w:val="single" w:sz="8" w:space="5" w:color="A0A0A0"/>
+        </w:pBdr>
+      </w:pPr>
+      <w:r>
+        <w:rPr>
+          <w:rFonts w:ascii="Times New Roman" w:hAnsi="Times New Roman" w:cs="Times New Roman"/>
+          <w:b w:val="1"/>
+          <w:i w:val="0"/>
+          <w:color w:val="1F1F1F"/>
+          <w:sz w:val="28"/>
+          <w:szCs w:val="28"/>
+        </w:rPr>
+        <w:t xml:space="preserve">RESEARCH EXPERIENCE</w:t>
+      </w:r>
+    </w:p>
+    <w:p>
+      <w:pPr>
+        <w:shd w:val="clear" w:fill="auto"/>
+        <w:spacing w:after="30" w:line="247" w:lineRule="auto" w:before="70" w:beforeAutospacing="0" w:afterAutospacing="0"/>
+        <w:jc w:val="left"/>
+        <w:widowControl w:val="1"/>
+        <w:keepNext w:val="1"/>
+        <w:keepLines w:val="1"/>
+      </w:pPr>
+      <w:r>
+        <w:rPr>
+          <w:rFonts w:ascii="Times New Roman" w:hAnsi="Times New Roman" w:cs="Times New Roman"/>
+          <w:b w:val="1"/>
+          <w:i w:val="0"/>
+          <w:color w:val="1F1F1F"/>
+          <w:sz w:val="22"/>
+          <w:szCs w:val="22"/>
+        </w:rPr>
+        <w:t xml:space="preserve">PhotonWM · MRR Acceleration for Autoregressive World Models</w:t>
+      </w:r>
+    </w:p>
+    <w:p>
+      <w:pPr>
+        <w:shd w:val="clear" w:fill="auto"/>
+        <w:spacing w:after="50" w:line="247" w:lineRule="auto" w:before="0" w:beforeAutospacing="0" w:afterAutospacing="0"/>
+        <w:jc w:val="left"/>
+        <w:widowControl w:val="1"/>
+        <w:keepNext w:val="1"/>
+        <w:keepLines w:val="1"/>
+      </w:pPr>
+      <w:r>
+        <w:rPr>
+          <w:rFonts w:ascii="Times New Roman" w:hAnsi="Times New Roman" w:cs="Times New Roman"/>
+          <w:b w:val="0"/>
+          <w:i w:val="1"/>
+          <w:color w:val="1F1F1F"/>
           <w:sz w:val="21"/>
-        </w:rPr>
-        <w:t>Xi'an Jiaotong-Liverpool University (XJTLU) | Suzhou, China</w:t>
-      </w:r>
-      <w:r>
-        <w:rPr>
-          <w:rFonts w:ascii="Times New Roman" w:hAnsi="Times New Roman" w:eastAsia="Times New Roman"/>
-          <w:b/>
-          <w:i w:val="0"/>
-          <w:color w:val="4E4E4E"/>
-          <w:sz w:val="20"/>
-        </w:rPr>
-        <w:t xml:space="preserve"> | Sep 2024 - Jul 2026</w:t>
-      </w:r>
-    </w:p>
-    <w:p>
-      <w:pPr>
-        <w:pStyle w:val="CVRole"/>
-        <w:keepNext/>
-        <w:keepLines/>
-        <w:spacing w:line="240" w:lineRule="auto"/>
-        <w:widowControl/>
-      </w:pPr>
-      <w:r>
-        <w:rPr>
-          <w:rFonts w:ascii="Times New Roman" w:hAnsi="Times New Roman" w:eastAsia="Times New Roman"/>
-          <w:b w:val="0"/>
-          <w:i/>
-          <w:color w:val="4E4E4E"/>
-          <w:sz w:val="20"/>
-        </w:rPr>
-        <w:t>University of Liverpool International Education Programme; programme title at XJTLU: Computer Science and Technology</w:t>
-      </w:r>
-    </w:p>
-    <w:p>
-      <w:pPr>
-        <w:pStyle w:val="CVBullet"/>
-        <w:keepNext w:val="0"/>
-        <w:keepLines w:val="0"/>
-        <w:spacing w:before="0" w:after="32" w:line="252" w:lineRule="auto"/>
-        <w:ind w:left="317" w:hanging="173" w:right="0"/>
-        <w:widowControl/>
-      </w:pPr>
-      <w:r>
-        <w:rPr>
-          <w:rFonts w:ascii="Times New Roman" w:hAnsi="Times New Roman" w:eastAsia="Times New Roman"/>
-          <w:b/>
-          <w:i w:val="0"/>
-          <w:color w:val="252525"/>
-          <w:sz w:val="20"/>
-        </w:rPr>
-        <w:t xml:space="preserve">• </w:t>
-      </w:r>
-      <w:r>
-        <w:rPr>
-          <w:rFonts w:ascii="Times New Roman" w:hAnsi="Times New Roman" w:eastAsia="Times New Roman"/>
-          <w:b w:val="0"/>
-          <w:i w:val="0"/>
-          <w:color w:val="252525"/>
-          <w:sz w:val="20"/>
-        </w:rPr>
-        <w:t>2025/26 weighted average: 71% (First-Class level). Selected marks: Computer Systems 88%, Engineering Mathematics II 86%, Digital Electronics I 76%, and Data Structures and Algorithms 76%.</w:t>
-      </w:r>
-    </w:p>
-    <w:p>
-      <w:pPr>
-        <w:keepNext/>
-        <w:keepLines/>
-        <w:spacing w:before="24" w:after="2" w:line="240" w:lineRule="auto"/>
-        <w:widowControl/>
-      </w:pPr>
-      <w:r>
-        <w:rPr>
-          <w:rFonts w:ascii="Times New Roman" w:hAnsi="Times New Roman" w:eastAsia="Times New Roman"/>
-          <w:b/>
-          <w:i w:val="0"/>
-          <w:color w:val="252525"/>
+          <w:szCs w:val="21"/>
+        </w:rPr>
+        <w:t xml:space="preserve">Student Researcher · Supervisor: Prof. Jiaqi Liu</w:t>
+      </w:r>
+      <w:r>
+        <w:rPr>
+          <w:rFonts w:ascii="Times New Roman" w:hAnsi="Times New Roman" w:cs="Times New Roman"/>
+          <w:b w:val="0"/>
+          <w:i w:val="0"/>
+          <w:color w:val="1F1F1F"/>
           <w:sz w:val="21"/>
-        </w:rPr>
-        <w:t>CEAIE Innovative Talents Science Training Programme</w:t>
-      </w:r>
-      <w:r>
-        <w:rPr>
-          <w:rFonts w:ascii="Times New Roman" w:hAnsi="Times New Roman" w:eastAsia="Times New Roman"/>
-          <w:b/>
-          <w:i w:val="0"/>
-          <w:color w:val="4E4E4E"/>
-          <w:sz w:val="20"/>
-        </w:rPr>
-        <w:t xml:space="preserve"> | Mar 2025 - May 2025</w:t>
-      </w:r>
-    </w:p>
-    <w:p>
-      <w:pPr>
-        <w:pStyle w:val="CVBullet"/>
-        <w:keepNext w:val="0"/>
-        <w:keepLines w:val="0"/>
-        <w:spacing w:before="0" w:after="32" w:line="252" w:lineRule="auto"/>
-        <w:ind w:left="317" w:hanging="173" w:right="0"/>
-        <w:widowControl/>
-      </w:pPr>
-      <w:r>
-        <w:rPr>
-          <w:rFonts w:ascii="Times New Roman" w:hAnsi="Times New Roman" w:eastAsia="Times New Roman"/>
-          <w:b/>
-          <w:i w:val="0"/>
-          <w:color w:val="252525"/>
-          <w:sz w:val="20"/>
-        </w:rPr>
-        <w:t xml:space="preserve">• </w:t>
-      </w:r>
-      <w:r>
-        <w:rPr>
-          <w:rFonts w:ascii="Times New Roman" w:hAnsi="Times New Roman" w:eastAsia="Times New Roman"/>
-          <w:b w:val="0"/>
-          <w:i w:val="0"/>
-          <w:color w:val="252525"/>
-          <w:sz w:val="20"/>
-        </w:rPr>
-        <w:t>Machine Learning, Network Security and Large Language Models, instructed by Prof. Pietro Liò (University of Cambridge); final grade 97.40 / A+.</w:t>
+          <w:szCs w:val="21"/>
+        </w:rPr>
+        <w:t xml:space="preserve"> | Jul 2026 – Present</w:t>
+      </w:r>
+    </w:p>
+    <w:p>
+      <w:pPr>
+        <w:numPr>
+          <w:ilvl w:val="0"/>
+          <w:numId w:val="3"/>
+        </w:numPr>
+        <w:shd w:val="clear" w:fill="auto"/>
+        <w:spacing w:before="0" w:beforeAutospacing="0" w:after="40" w:afterAutospacing="0" w:line="247" w:lineRule="auto"/>
+        <w:ind w:left="465" w:hanging="360"/>
+        <w:jc w:val="left"/>
+        <w:widowControl w:val="1"/>
+        <w:keepLines w:val="1"/>
+      </w:pPr>
+      <w:r>
+        <w:rPr>
+          <w:rFonts w:ascii="Times New Roman" w:hAnsi="Times New Roman" w:cs="Times New Roman"/>
+          <w:b w:val="0"/>
+          <w:i w:val="0"/>
+          <w:color w:val="1F1F1F"/>
+          <w:sz w:val="22"/>
+          <w:szCs w:val="22"/>
+        </w:rPr>
+        <w:t xml:space="preserve">Co-designed a hybrid photonic–electronic architecture mapping fixed-weight Linear operators to 64 × 64 microring-resonator arrays, with dynamic attention, nonlinearities, sampling and control retained on the electronic backend.</w:t>
+      </w:r>
+    </w:p>
+    <w:p>
+      <w:pPr>
+        <w:numPr>
+          <w:ilvl w:val="0"/>
+          <w:numId w:val="3"/>
+        </w:numPr>
+        <w:shd w:val="clear" w:fill="auto"/>
+        <w:spacing w:before="0" w:beforeAutospacing="0" w:after="40" w:afterAutospacing="0" w:line="247" w:lineRule="auto"/>
+        <w:ind w:left="465" w:hanging="360"/>
+        <w:jc w:val="left"/>
+        <w:widowControl w:val="1"/>
+        <w:keepLines w:val="1"/>
+      </w:pPr>
+      <w:r>
+        <w:rPr>
+          <w:rFonts w:ascii="Times New Roman" w:hAnsi="Times New Roman" w:cs="Times New Roman"/>
+          <w:b w:val="0"/>
+          <w:i w:val="0"/>
+          <w:color w:val="1F1F1F"/>
+          <w:sz w:val="22"/>
+          <w:szCs w:val="22"/>
+        </w:rPr>
+        <w:t xml:space="preserve">Reproduced and profiled the official LPWM BAIR-128 checkpoint on an RTX 5090; built operator and tensor-shape ledgers and identified recurrent Dynamics execution as 91.56% of measured stage latency.</w:t>
+      </w:r>
+    </w:p>
+    <w:p>
+      <w:pPr>
+        <w:numPr>
+          <w:ilvl w:val="0"/>
+          <w:numId w:val="3"/>
+        </w:numPr>
+        <w:shd w:val="clear" w:fill="auto"/>
+        <w:spacing w:before="0" w:beforeAutospacing="0" w:after="40" w:afterAutospacing="0" w:line="247" w:lineRule="auto"/>
+        <w:ind w:left="465" w:hanging="360"/>
+        <w:jc w:val="left"/>
+        <w:widowControl w:val="1"/>
+        <w:keepLines w:val="1"/>
+      </w:pPr>
+      <w:r>
+        <w:rPr>
+          <w:rFonts w:ascii="Times New Roman" w:hAnsi="Times New Roman" w:cs="Times New Roman"/>
+          <w:b w:val="0"/>
+          <w:i w:val="0"/>
+          <w:color w:val="1F1F1F"/>
+          <w:sz w:val="22"/>
+          <w:szCs w:val="22"/>
+        </w:rPr>
+        <w:t xml:space="preserve">Integrated measured traces with LLMCompass, SimPhony and event-driven scheduling to evaluate weight residency, MRR programming, conversion, latency, energy and rollout quality. Contributed evaluation methodology and manuscript revision.</w:t>
+      </w:r>
+    </w:p>
+    <w:p>
+      <w:pPr>
+        <w:shd w:val="clear" w:fill="auto"/>
+        <w:spacing w:after="50" w:line="247" w:lineRule="auto" w:before="0" w:beforeAutospacing="0" w:afterAutospacing="0"/>
+        <w:jc w:val="left"/>
+        <w:widowControl w:val="1"/>
+        <w:keepLines w:val="1"/>
+      </w:pPr>
+      <w:r>
+        <w:rPr>
+          <w:rFonts w:ascii="Times New Roman" w:hAnsi="Times New Roman" w:cs="Times New Roman"/>
+          <w:b w:val="0"/>
+          <w:i w:val="1"/>
+          <w:color w:val="1F1F1F"/>
+          <w:sz w:val="21"/>
+          <w:szCs w:val="21"/>
+        </w:rPr>
+        <w:t xml:space="preserve">Full manuscript submitted to DATE 2027.</w:t>
+      </w:r>
+    </w:p>
+    <w:p>
+      <w:pPr>
+        <w:shd w:val="clear" w:fill="auto"/>
+        <w:spacing w:after="30" w:line="247" w:lineRule="auto" w:before="70" w:beforeAutospacing="0" w:afterAutospacing="0"/>
+        <w:jc w:val="left"/>
+        <w:widowControl w:val="1"/>
+        <w:keepNext w:val="1"/>
+        <w:keepLines w:val="1"/>
+      </w:pPr>
+      <w:r>
+        <w:rPr>
+          <w:rFonts w:ascii="Times New Roman" w:hAnsi="Times New Roman" w:cs="Times New Roman"/>
+          <w:b w:val="1"/>
+          <w:i w:val="0"/>
+          <w:color w:val="1F1F1F"/>
+          <w:sz w:val="22"/>
+          <w:szCs w:val="22"/>
+        </w:rPr>
+        <w:t xml:space="preserve">SURF 2026 · Collaborative Proof-of-Sensing and Multi-Robot Auditing</w:t>
+      </w:r>
+    </w:p>
+    <w:p>
+      <w:pPr>
+        <w:shd w:val="clear" w:fill="auto"/>
+        <w:spacing w:after="50" w:line="247" w:lineRule="auto" w:before="0" w:beforeAutospacing="0" w:afterAutospacing="0"/>
+        <w:jc w:val="left"/>
+        <w:widowControl w:val="1"/>
+        <w:keepNext w:val="1"/>
+        <w:keepLines w:val="1"/>
+      </w:pPr>
+      <w:r>
+        <w:rPr>
+          <w:rFonts w:ascii="Times New Roman" w:hAnsi="Times New Roman" w:cs="Times New Roman"/>
+          <w:b w:val="0"/>
+          <w:i w:val="1"/>
+          <w:color w:val="1F1F1F"/>
+          <w:sz w:val="21"/>
+          <w:szCs w:val="21"/>
+        </w:rPr>
+        <w:t xml:space="preserve">Summer Undergraduate Research Fellow · Supervisor: Prof. Limin Yu</w:t>
+      </w:r>
+      <w:r>
+        <w:rPr>
+          <w:rFonts w:ascii="Times New Roman" w:hAnsi="Times New Roman" w:cs="Times New Roman"/>
+          <w:b w:val="0"/>
+          <w:i w:val="0"/>
+          <w:color w:val="1F1F1F"/>
+          <w:sz w:val="21"/>
+          <w:szCs w:val="21"/>
+        </w:rPr>
+        <w:t xml:space="preserve"> | Jun – Aug 2026</w:t>
+      </w:r>
+    </w:p>
+    <w:p>
+      <w:pPr>
+        <w:numPr>
+          <w:ilvl w:val="0"/>
+          <w:numId w:val="3"/>
+        </w:numPr>
+        <w:shd w:val="clear" w:fill="auto"/>
+        <w:spacing w:before="0" w:beforeAutospacing="0" w:after="40" w:afterAutospacing="0" w:line="247" w:lineRule="auto"/>
+        <w:ind w:left="465" w:hanging="360"/>
+        <w:jc w:val="left"/>
+        <w:widowControl w:val="1"/>
+        <w:keepLines w:val="1"/>
+      </w:pPr>
+      <w:r>
+        <w:rPr>
+          <w:rFonts w:ascii="Times New Roman" w:hAnsi="Times New Roman" w:cs="Times New Roman"/>
+          <w:b w:val="0"/>
+          <w:i w:val="0"/>
+          <w:color w:val="1F1F1F"/>
+          <w:sz w:val="22"/>
+          <w:szCs w:val="22"/>
+        </w:rPr>
+        <w:t xml:space="preserve">Conducted largely independent literature-to-prototype research on CPoS and lightweight trusted auditing for UAV, surface and underwater robot missions.</w:t>
+      </w:r>
+    </w:p>
+    <w:p>
+      <w:pPr>
+        <w:numPr>
+          <w:ilvl w:val="0"/>
+          <w:numId w:val="3"/>
+        </w:numPr>
+        <w:shd w:val="clear" w:fill="auto"/>
+        <w:spacing w:before="0" w:beforeAutospacing="0" w:after="40" w:afterAutospacing="0" w:line="247" w:lineRule="auto"/>
+        <w:ind w:left="465" w:hanging="360"/>
+        <w:jc w:val="left"/>
+        <w:widowControl w:val="1"/>
+        <w:keepLines w:val="1"/>
+      </w:pPr>
+      <w:r>
+        <w:rPr>
+          <w:rFonts w:ascii="Times New Roman" w:hAnsi="Times New Roman" w:cs="Times New Roman"/>
+          <w:b w:val="0"/>
+          <w:i w:val="0"/>
+          <w:color w:val="1F1F1F"/>
+          <w:sz w:val="22"/>
+          <w:szCs w:val="22"/>
+        </w:rPr>
+        <w:t xml:space="preserve">Implemented and tested a local Hardhat EVM network, Solidity sensing registry and ethers.js client for digest submission, retrieval and audit events; documented transaction and gas evidence while keeping raw sensing data off-chain.</w:t>
+      </w:r>
+    </w:p>
+    <w:p>
+      <w:pPr>
+        <w:numPr>
+          <w:ilvl w:val="0"/>
+          <w:numId w:val="3"/>
+        </w:numPr>
+        <w:shd w:val="clear" w:fill="auto"/>
+        <w:spacing w:before="0" w:beforeAutospacing="0" w:after="40" w:afterAutospacing="0" w:line="247" w:lineRule="auto"/>
+        <w:ind w:left="465" w:hanging="360"/>
+        <w:jc w:val="left"/>
+        <w:widowControl w:val="1"/>
+        <w:keepLines w:val="1"/>
+      </w:pPr>
+      <w:r>
+        <w:rPr>
+          <w:rFonts w:ascii="Times New Roman" w:hAnsi="Times New Roman" w:cs="Times New Roman"/>
+          <w:b w:val="0"/>
+          <w:i w:val="0"/>
+          <w:color w:val="1F1F1F"/>
+          <w:sz w:val="22"/>
+          <w:szCs w:val="22"/>
+        </w:rPr>
+        <w:t xml:space="preserve">Built a three-X500 ROS 2 Jazzy / Gazebo Harmonic / PX4 v1.17 simulation environment with separate identities and namespaces; validated take-off, hover, waypoint, return and landing. Specified a next-stage protocol for signed multi-source mission evidence and future physical-sensing verification.</w:t>
+      </w:r>
+    </w:p>
+    <w:p>
+      <w:pPr>
+        <w:shd w:val="clear" w:fill="auto"/>
+        <w:spacing w:after="50" w:line="247" w:lineRule="auto" w:before="0" w:beforeAutospacing="0" w:afterAutospacing="0"/>
+        <w:jc w:val="left"/>
+        <w:widowControl w:val="1"/>
+        <w:keepLines w:val="1"/>
+      </w:pPr>
+      <w:r>
+        <w:rPr>
+          <w:rFonts w:ascii="Times New Roman" w:hAnsi="Times New Roman" w:cs="Times New Roman"/>
+          <w:b w:val="0"/>
+          <w:i w:val="1"/>
+          <w:color w:val="1F1F1F"/>
+          <w:sz w:val="21"/>
+          <w:szCs w:val="21"/>
+        </w:rPr>
+        <w:t xml:space="preserve">Programme completed; SURF certificate issued September 2026.</w:t>
+      </w:r>
+    </w:p>
+    <w:p>
+      <w:pPr>
+        <w:shd w:val="clear" w:fill="auto"/>
+        <w:spacing w:after="30" w:line="247" w:lineRule="auto" w:before="70" w:beforeAutospacing="0" w:afterAutospacing="0"/>
+        <w:jc w:val="left"/>
+        <w:widowControl w:val="1"/>
+        <w:keepNext w:val="1"/>
+        <w:keepLines w:val="1"/>
+      </w:pPr>
+      <w:r>
+        <w:rPr>
+          <w:rFonts w:ascii="Times New Roman" w:hAnsi="Times New Roman" w:cs="Times New Roman"/>
+          <w:b w:val="1"/>
+          <w:i w:val="0"/>
+          <w:color w:val="1F1F1F"/>
+          <w:sz w:val="22"/>
+          <w:szCs w:val="22"/>
+        </w:rPr>
+        <w:t xml:space="preserve">Low-Resource Cantonese–English Neural Machine Translation</w:t>
+      </w:r>
+    </w:p>
+    <w:p>
+      <w:pPr>
+        <w:shd w:val="clear" w:fill="auto"/>
+        <w:spacing w:after="50" w:line="247" w:lineRule="auto" w:before="0" w:beforeAutospacing="0" w:afterAutospacing="0"/>
+        <w:jc w:val="left"/>
+        <w:widowControl w:val="1"/>
+        <w:keepNext w:val="1"/>
+        <w:keepLines w:val="1"/>
+      </w:pPr>
+      <w:r>
+        <w:rPr>
+          <w:rFonts w:ascii="Times New Roman" w:hAnsi="Times New Roman" w:cs="Times New Roman"/>
+          <w:b w:val="0"/>
+          <w:i w:val="1"/>
+          <w:color w:val="1F1F1F"/>
+          <w:sz w:val="21"/>
+          <w:szCs w:val="21"/>
+        </w:rPr>
+        <w:t xml:space="preserve">Researcher · Co-second author and presenter, ICRAI 2025</w:t>
+      </w:r>
+      <w:r>
+        <w:rPr>
+          <w:rFonts w:ascii="Times New Roman" w:hAnsi="Times New Roman" w:cs="Times New Roman"/>
+          <w:b w:val="0"/>
+          <w:i w:val="0"/>
+          <w:color w:val="1F1F1F"/>
+          <w:sz w:val="21"/>
+          <w:szCs w:val="21"/>
+        </w:rPr>
+        <w:t xml:space="preserve"> | Jun 2025 – Jan 2026</w:t>
+      </w:r>
+    </w:p>
+    <w:p>
+      <w:pPr>
+        <w:numPr>
+          <w:ilvl w:val="0"/>
+          <w:numId w:val="3"/>
+        </w:numPr>
+        <w:shd w:val="clear" w:fill="auto"/>
+        <w:spacing w:before="0" w:beforeAutospacing="0" w:after="40" w:afterAutospacing="0" w:line="247" w:lineRule="auto"/>
+        <w:ind w:left="465" w:hanging="360"/>
+        <w:jc w:val="left"/>
+        <w:widowControl w:val="1"/>
+        <w:keepLines w:val="1"/>
+        <w:keepNext w:val="1"/>
+      </w:pPr>
+      <w:r>
+        <w:rPr>
+          <w:rFonts w:ascii="Times New Roman" w:hAnsi="Times New Roman" w:cs="Times New Roman"/>
+          <w:b w:val="0"/>
+          <w:i w:val="0"/>
+          <w:color w:val="1F1F1F"/>
+          <w:sz w:val="22"/>
+          <w:szCs w:val="22"/>
+        </w:rPr>
+        <w:t xml:space="preserve">Constructed and cleaned a 1.1-million-pair parallel corpus using syntactic filtering, normalisation, deduplication and LaBSE-based semantic alignment.</w:t>
+      </w:r>
+    </w:p>
+    <w:p>
+      <w:pPr>
+        <w:numPr>
+          <w:ilvl w:val="0"/>
+          <w:numId w:val="3"/>
+        </w:numPr>
+        <w:shd w:val="clear" w:fill="auto"/>
+        <w:spacing w:before="0" w:beforeAutospacing="0" w:after="40" w:afterAutospacing="0" w:line="247" w:lineRule="auto"/>
+        <w:ind w:left="465" w:hanging="360"/>
+        <w:jc w:val="left"/>
+        <w:widowControl w:val="1"/>
+        <w:keepLines w:val="1"/>
+      </w:pPr>
+      <w:r>
+        <w:rPr>
+          <w:rFonts w:ascii="Times New Roman" w:hAnsi="Times New Roman" w:cs="Times New Roman"/>
+          <w:b w:val="0"/>
+          <w:i w:val="0"/>
+          <w:color w:val="1F1F1F"/>
+          <w:sz w:val="22"/>
+          <w:szCs w:val="22"/>
+        </w:rPr>
+        <w:t xml:space="preserve">Fine-tuned NLLB-200-distilled-600M and designed a nested pseudo-data sampling strategy; the best 200k:200k pseudo-to-real setting achieved BLEU 29.63 and chrF 56.65.</w:t>
       </w:r>
     </w:p>
     <w:p>
       <w:pPr>
         <w:pStyle w:val="3"/>
-        <w:keepNext/>
-        <w:keepLines/>
-        <w:pageBreakBefore w:val="0"/>
+        <w:shd w:val="clear" w:fill="auto"/>
+        <w:spacing w:before="120" w:after="65" w:line="247" w:lineRule="auto" w:beforeAutospacing="0" w:afterAutospacing="0"/>
+        <w:jc w:val="left"/>
+        <w:widowControl w:val="1"/>
+        <w:keepNext w:val="1"/>
+        <w:keepLines w:val="1"/>
         <w:pBdr>
-          <w:bottom w:val="single" w:sz="5" w:space="2" w:color="6F7780"/>
+          <w:top w:val="single" w:sz="8" w:space="5" w:color="A0A0A0"/>
         </w:pBdr>
-        <w:widowControl/>
-      </w:pPr>
-      <w:r>
-        <w:t>RESEARCH EXPERIENCE</w:t>
-      </w:r>
-    </w:p>
-    <w:p>
-      <w:pPr>
-        <w:keepNext/>
-        <w:keepLines/>
-        <w:spacing w:before="24" w:after="2" w:line="240" w:lineRule="auto"/>
-        <w:widowControl/>
-      </w:pPr>
-      <w:r>
-        <w:rPr>
-          <w:rFonts w:ascii="Times New Roman" w:hAnsi="Times New Roman" w:eastAsia="Times New Roman"/>
-          <w:b/>
-          <w:i w:val="0"/>
-          <w:color w:val="252525"/>
+      </w:pPr>
+      <w:r>
+        <w:rPr>
+          <w:rFonts w:ascii="Times New Roman" w:hAnsi="Times New Roman" w:cs="Times New Roman"/>
+          <w:b w:val="1"/>
+          <w:i w:val="0"/>
+          <w:color w:val="1F1F1F"/>
+          <w:sz w:val="28"/>
+          <w:szCs w:val="28"/>
+        </w:rPr>
+        <w:t xml:space="preserve">PROFESSIONAL EXPERIENCE</w:t>
+      </w:r>
+    </w:p>
+    <w:p>
+      <w:pPr>
+        <w:shd w:val="clear" w:fill="auto"/>
+        <w:spacing w:after="30" w:line="247" w:lineRule="auto" w:before="70" w:beforeAutospacing="0" w:afterAutospacing="0"/>
+        <w:jc w:val="left"/>
+        <w:widowControl w:val="1"/>
+        <w:keepNext w:val="1"/>
+        <w:keepLines w:val="1"/>
+      </w:pPr>
+      <w:r>
+        <w:rPr>
+          <w:rFonts w:ascii="Times New Roman" w:hAnsi="Times New Roman" w:cs="Times New Roman"/>
+          <w:b w:val="1"/>
+          <w:i w:val="0"/>
+          <w:color w:val="1F1F1F"/>
+          <w:sz w:val="22"/>
+          <w:szCs w:val="22"/>
+        </w:rPr>
+        <w:t xml:space="preserve">Research Institute of Tsinghua University in Shenzhen</w:t>
+      </w:r>
+    </w:p>
+    <w:p>
+      <w:pPr>
+        <w:shd w:val="clear" w:fill="auto"/>
+        <w:spacing w:after="50" w:line="247" w:lineRule="auto" w:before="0" w:beforeAutospacing="0" w:afterAutospacing="0"/>
+        <w:jc w:val="left"/>
+        <w:widowControl w:val="1"/>
+        <w:keepNext w:val="1"/>
+        <w:keepLines w:val="1"/>
+      </w:pPr>
+      <w:r>
+        <w:rPr>
+          <w:rFonts w:ascii="Times New Roman" w:hAnsi="Times New Roman" w:cs="Times New Roman"/>
+          <w:b w:val="0"/>
+          <w:i w:val="1"/>
+          <w:color w:val="1F1F1F"/>
           <w:sz w:val="21"/>
-        </w:rPr>
-        <w:t>PhotonWM: Trace-Driven MRR Acceleration for Autoregressive World Models</w:t>
-      </w:r>
-      <w:r>
-        <w:rPr>
-          <w:rFonts w:ascii="Times New Roman" w:hAnsi="Times New Roman" w:eastAsia="Times New Roman"/>
-          <w:b/>
-          <w:i w:val="0"/>
-          <w:color w:val="4E4E4E"/>
-          <w:sz w:val="20"/>
-        </w:rPr>
-        <w:t xml:space="preserve"> | Jul 2026 - Present</w:t>
-      </w:r>
-    </w:p>
-    <w:p>
-      <w:pPr>
-        <w:pStyle w:val="CVRole"/>
-        <w:keepNext/>
-        <w:keepLines/>
-        <w:spacing w:line="240" w:lineRule="auto"/>
-        <w:widowControl/>
-      </w:pPr>
-      <w:r>
-        <w:rPr>
-          <w:rFonts w:ascii="Times New Roman" w:hAnsi="Times New Roman" w:eastAsia="Times New Roman"/>
-          <w:b w:val="0"/>
-          <w:i/>
-          <w:color w:val="4E4E4E"/>
-          <w:sz w:val="20"/>
-        </w:rPr>
-        <w:t>Student Researcher | Supervisor: Prof. Jiaqi Liu</w:t>
-      </w:r>
-    </w:p>
-    <w:p>
-      <w:pPr>
-        <w:pStyle w:val="CVBullet"/>
-        <w:keepNext/>
-        <w:keepLines w:val="0"/>
-        <w:spacing w:before="0" w:after="32" w:line="252" w:lineRule="auto"/>
-        <w:ind w:left="317" w:hanging="173" w:right="0"/>
-        <w:widowControl/>
-      </w:pPr>
-      <w:r>
-        <w:rPr>
-          <w:rFonts w:ascii="Times New Roman" w:hAnsi="Times New Roman" w:eastAsia="Times New Roman"/>
-          <w:b/>
-          <w:i w:val="0"/>
-          <w:color w:val="252525"/>
-          <w:sz w:val="20"/>
-        </w:rPr>
-        <w:t xml:space="preserve">• </w:t>
-      </w:r>
-      <w:r>
-        <w:rPr>
-          <w:rFonts w:ascii="Times New Roman" w:hAnsi="Times New Roman" w:eastAsia="Times New Roman"/>
-          <w:b w:val="0"/>
-          <w:i w:val="0"/>
-          <w:color w:val="252525"/>
-          <w:sz w:val="20"/>
-        </w:rPr>
-        <w:t>Co-designed a hybrid photonic-electronic inference architecture that maps fixed-weight Linear operators to 64 x 64 microring-resonator arrays while retaining dynamic attention, nonlinearities, sampling and control on the electronic path.</w:t>
-      </w:r>
-    </w:p>
-    <w:p>
-      <w:pPr>
-        <w:pStyle w:val="CVBullet"/>
-        <w:keepNext/>
-        <w:keepLines w:val="0"/>
-        <w:spacing w:before="0" w:after="32" w:line="252" w:lineRule="auto"/>
-        <w:ind w:left="317" w:hanging="173" w:right="0"/>
-        <w:widowControl/>
-      </w:pPr>
-      <w:r>
-        <w:rPr>
-          <w:rFonts w:ascii="Times New Roman" w:hAnsi="Times New Roman" w:eastAsia="Times New Roman"/>
-          <w:b/>
-          <w:i w:val="0"/>
-          <w:color w:val="252525"/>
-          <w:sz w:val="20"/>
-        </w:rPr>
-        <w:t xml:space="preserve">• </w:t>
-      </w:r>
-      <w:r>
-        <w:rPr>
-          <w:rFonts w:ascii="Times New Roman" w:hAnsi="Times New Roman" w:eastAsia="Times New Roman"/>
-          <w:b w:val="0"/>
-          <w:i w:val="0"/>
-          <w:color w:val="252525"/>
-          <w:sz w:val="20"/>
-        </w:rPr>
-        <w:t>Reproduced and profiled the official LPWM BAIR-128 checkpoint on an RTX 5090; constructed operator and tensor-shape ledgers for a 30-step rollout and identified recurrent Dynamics execution as 91.56% of measured stage latency.</w:t>
-      </w:r>
-    </w:p>
-    <w:p>
-      <w:pPr>
-        <w:pStyle w:val="CVBullet"/>
-        <w:keepNext w:val="0"/>
-        <w:keepLines w:val="0"/>
-        <w:spacing w:before="0" w:after="32" w:line="252" w:lineRule="auto"/>
-        <w:ind w:left="317" w:hanging="173" w:right="0"/>
-        <w:widowControl/>
-      </w:pPr>
-      <w:r>
-        <w:rPr>
-          <w:rFonts w:ascii="Times New Roman" w:hAnsi="Times New Roman" w:eastAsia="Times New Roman"/>
-          <w:b/>
-          <w:i w:val="0"/>
-          <w:color w:val="252525"/>
-          <w:sz w:val="20"/>
-        </w:rPr>
-        <w:t xml:space="preserve">• </w:t>
-      </w:r>
-      <w:r>
-        <w:rPr>
-          <w:rFonts w:ascii="Times New Roman" w:hAnsi="Times New Roman" w:eastAsia="Times New Roman"/>
-          <w:b w:val="0"/>
-          <w:i w:val="0"/>
-          <w:color w:val="252525"/>
-          <w:sz w:val="20"/>
-        </w:rPr>
-        <w:t>Integrated measured traces with LLMCompass digital baselines, SimPhony device/circuit costs and an event-driven scheduler for weight residency, MRR programming, conversion, latency, energy and recurrent-quality analysis; contributed the Evaluation methodology and bilingual manuscript revision. Full paper submitted to DATE 2027; decision pending.</w:t>
-      </w:r>
-    </w:p>
-    <w:p>
-      <w:pPr>
-        <w:keepNext/>
-        <w:keepLines/>
-        <w:spacing w:before="24" w:after="2" w:line="240" w:lineRule="auto"/>
-        <w:widowControl/>
-      </w:pPr>
-      <w:r>
-        <w:rPr>
-          <w:rFonts w:ascii="Times New Roman" w:hAnsi="Times New Roman" w:eastAsia="Times New Roman"/>
-          <w:b/>
-          <w:i w:val="0"/>
-          <w:color w:val="252525"/>
+          <w:szCs w:val="21"/>
+        </w:rPr>
+        <w:t xml:space="preserve">R&amp;D Intern · Marine Hydrogen Energy R&amp;D Center</w:t>
+      </w:r>
+      <w:r>
+        <w:rPr>
+          <w:rFonts w:ascii="Times New Roman" w:hAnsi="Times New Roman" w:cs="Times New Roman"/>
+          <w:b w:val="0"/>
+          <w:i w:val="0"/>
+          <w:color w:val="1F1F1F"/>
           <w:sz w:val="21"/>
-        </w:rPr>
-        <w:t>SURF 2026: Collaborative Proof-of-Sensing and Trusted Multi-Robot Auditing</w:t>
-      </w:r>
-      <w:r>
-        <w:rPr>
-          <w:rFonts w:ascii="Times New Roman" w:hAnsi="Times New Roman" w:eastAsia="Times New Roman"/>
-          <w:b/>
-          <w:i w:val="0"/>
-          <w:color w:val="4E4E4E"/>
-          <w:sz w:val="20"/>
-        </w:rPr>
-        <w:t xml:space="preserve"> | Jun 2026 - Aug 2026</w:t>
-      </w:r>
-    </w:p>
-    <w:p>
-      <w:pPr>
-        <w:pStyle w:val="CVRole"/>
-        <w:keepNext/>
-        <w:keepLines/>
-        <w:spacing w:line="240" w:lineRule="auto"/>
-        <w:widowControl/>
-      </w:pPr>
-      <w:r>
-        <w:rPr>
-          <w:rFonts w:ascii="Times New Roman" w:hAnsi="Times New Roman" w:eastAsia="Times New Roman"/>
-          <w:b w:val="0"/>
-          <w:i/>
-          <w:color w:val="4E4E4E"/>
-          <w:sz w:val="20"/>
-        </w:rPr>
-        <w:t>Research Student, Blockchain Security Group | Supervisor: Prof. Limin Yu</w:t>
-      </w:r>
-    </w:p>
-    <w:p>
-      <w:pPr>
-        <w:pStyle w:val="CVBullet"/>
-        <w:keepNext/>
-        <w:keepLines w:val="0"/>
-        <w:spacing w:before="0" w:after="32" w:line="252" w:lineRule="auto"/>
-        <w:ind w:left="317" w:hanging="173" w:right="0"/>
-        <w:widowControl/>
-      </w:pPr>
-      <w:r>
-        <w:rPr>
-          <w:rFonts w:ascii="Times New Roman" w:hAnsi="Times New Roman" w:eastAsia="Times New Roman"/>
-          <w:b/>
-          <w:i w:val="0"/>
-          <w:color w:val="252525"/>
-          <w:sz w:val="20"/>
-        </w:rPr>
-        <w:t xml:space="preserve">• </w:t>
-      </w:r>
-      <w:r>
-        <w:rPr>
-          <w:rFonts w:ascii="Times New Roman" w:hAnsi="Times New Roman" w:eastAsia="Times New Roman"/>
-          <w:b w:val="0"/>
-          <w:i w:val="0"/>
-          <w:color w:val="252525"/>
-          <w:sz w:val="20"/>
-        </w:rPr>
-        <w:t>Conducted largely independent literature-to-prototype research on Collaborative Proof-of-Sensing (CPoS) and lightweight trusted auditing for UAV, surface and underwater robot missions.</w:t>
-      </w:r>
-    </w:p>
-    <w:p>
-      <w:pPr>
-        <w:pStyle w:val="CVBullet"/>
-        <w:keepNext/>
-        <w:keepLines w:val="0"/>
-        <w:spacing w:before="0" w:after="32" w:line="252" w:lineRule="auto"/>
-        <w:ind w:left="317" w:hanging="173" w:right="0"/>
-        <w:widowControl/>
-      </w:pPr>
-      <w:r>
-        <w:rPr>
-          <w:rFonts w:ascii="Times New Roman" w:hAnsi="Times New Roman" w:eastAsia="Times New Roman"/>
-          <w:b/>
-          <w:i w:val="0"/>
-          <w:color w:val="252525"/>
-          <w:sz w:val="20"/>
-        </w:rPr>
-        <w:t xml:space="preserve">• </w:t>
-      </w:r>
-      <w:r>
-        <w:rPr>
-          <w:rFonts w:ascii="Times New Roman" w:hAnsi="Times New Roman" w:eastAsia="Times New Roman"/>
-          <w:b w:val="0"/>
-          <w:i w:val="0"/>
-          <w:color w:val="252525"/>
-          <w:sz w:val="20"/>
-        </w:rPr>
-        <w:t>Implemented and tested a Hardhat local EVM network, Solidity sensing registry and ethers.js client for digest submission, retrieval and audit events; documented reproducible transaction and gas evidence while keeping raw sensing data off-chain.</w:t>
-      </w:r>
-    </w:p>
-    <w:p>
-      <w:pPr>
-        <w:pStyle w:val="CVBullet"/>
-        <w:keepNext w:val="0"/>
-        <w:keepLines w:val="0"/>
-        <w:spacing w:before="0" w:after="32" w:line="252" w:lineRule="auto"/>
-        <w:ind w:left="317" w:hanging="173" w:right="0"/>
-        <w:widowControl/>
-      </w:pPr>
-      <w:r>
-        <w:rPr>
-          <w:rFonts w:ascii="Times New Roman" w:hAnsi="Times New Roman" w:eastAsia="Times New Roman"/>
-          <w:b/>
-          <w:i w:val="0"/>
-          <w:color w:val="252525"/>
-          <w:sz w:val="20"/>
-        </w:rPr>
-        <w:t xml:space="preserve">• </w:t>
-      </w:r>
-      <w:r>
-        <w:rPr>
-          <w:rFonts w:ascii="Times New Roman" w:hAnsi="Times New Roman" w:eastAsia="Times New Roman"/>
-          <w:b w:val="0"/>
-          <w:i w:val="0"/>
-          <w:color w:val="252525"/>
-          <w:sz w:val="20"/>
-        </w:rPr>
-        <w:t>Built a ROS 2 Jazzy, Gazebo Harmonic and PX4 v1.17 three-X500 environment with independent identities and namespaces, and validated a headless take-off, hover, waypoint, return and landing workflow. Specified the next-stage protocol for signed multi-source mission evidence and future end-to-end physical-sensing verification.</w:t>
-      </w:r>
-    </w:p>
-    <w:p>
-      <w:pPr>
-        <w:keepNext/>
-        <w:keepLines/>
-        <w:spacing w:before="24" w:after="2" w:line="240" w:lineRule="auto"/>
-        <w:widowControl/>
-      </w:pPr>
-      <w:r>
-        <w:rPr>
-          <w:rFonts w:ascii="Times New Roman" w:hAnsi="Times New Roman" w:eastAsia="Times New Roman"/>
-          <w:b/>
-          <w:i w:val="0"/>
-          <w:color w:val="252525"/>
+          <w:szCs w:val="21"/>
+        </w:rPr>
+        <w:t xml:space="preserve"> | May – Jul 2026</w:t>
+      </w:r>
+    </w:p>
+    <w:p>
+      <w:pPr>
+        <w:numPr>
+          <w:ilvl w:val="0"/>
+          <w:numId w:val="3"/>
+        </w:numPr>
+        <w:shd w:val="clear" w:fill="auto"/>
+        <w:spacing w:before="0" w:beforeAutospacing="0" w:after="40" w:afterAutospacing="0" w:line="247" w:lineRule="auto"/>
+        <w:ind w:left="465" w:hanging="360"/>
+        <w:jc w:val="left"/>
+        <w:widowControl w:val="1"/>
+        <w:keepLines w:val="1"/>
+      </w:pPr>
+      <w:r>
+        <w:rPr>
+          <w:rFonts w:ascii="Times New Roman" w:hAnsi="Times New Roman" w:cs="Times New Roman"/>
+          <w:b w:val="0"/>
+          <w:i w:val="0"/>
+          <w:color w:val="1F1F1F"/>
+          <w:sz w:val="22"/>
+          <w:szCs w:val="22"/>
+        </w:rPr>
+        <w:t xml:space="preserve">Completed a two-month R&amp;D placement; the official internship certificate commends initiative, collaboration and strong overall performance.</w:t>
+      </w:r>
+    </w:p>
+    <w:p>
+      <w:pPr>
+        <w:shd w:val="clear" w:fill="auto"/>
+        <w:spacing w:after="30" w:line="247" w:lineRule="auto" w:before="70" w:beforeAutospacing="0" w:afterAutospacing="0"/>
+        <w:jc w:val="left"/>
+        <w:widowControl w:val="1"/>
+        <w:keepNext w:val="1"/>
+        <w:keepLines w:val="1"/>
+      </w:pPr>
+      <w:r>
+        <w:rPr>
+          <w:rFonts w:ascii="Times New Roman" w:hAnsi="Times New Roman" w:cs="Times New Roman"/>
+          <w:b w:val="1"/>
+          <w:i w:val="0"/>
+          <w:color w:val="1F1F1F"/>
+          <w:sz w:val="22"/>
+          <w:szCs w:val="22"/>
+        </w:rPr>
+        <w:t xml:space="preserve">Wuhan University City Hospital Co., Ltd.</w:t>
+      </w:r>
+    </w:p>
+    <w:p>
+      <w:pPr>
+        <w:shd w:val="clear" w:fill="auto"/>
+        <w:spacing w:after="50" w:line="247" w:lineRule="auto" w:before="0" w:beforeAutospacing="0" w:afterAutospacing="0"/>
+        <w:jc w:val="left"/>
+        <w:widowControl w:val="1"/>
+        <w:keepNext w:val="1"/>
+        <w:keepLines w:val="1"/>
+      </w:pPr>
+      <w:r>
+        <w:rPr>
+          <w:rFonts w:ascii="Times New Roman" w:hAnsi="Times New Roman" w:cs="Times New Roman"/>
+          <w:b w:val="0"/>
+          <w:i w:val="1"/>
+          <w:color w:val="1F1F1F"/>
           <w:sz w:val="21"/>
-        </w:rPr>
-        <w:t>Low-Resource Cantonese-English Neural Machine Translation</w:t>
-      </w:r>
-      <w:r>
-        <w:rPr>
-          <w:rFonts w:ascii="Times New Roman" w:hAnsi="Times New Roman" w:eastAsia="Times New Roman"/>
-          <w:b/>
-          <w:i w:val="0"/>
-          <w:color w:val="4E4E4E"/>
-          <w:sz w:val="20"/>
-        </w:rPr>
-        <w:t xml:space="preserve"> | Jun 2025 - Jan 2026</w:t>
-      </w:r>
-    </w:p>
-    <w:p>
-      <w:pPr>
-        <w:pStyle w:val="CVRole"/>
-        <w:keepNext/>
-        <w:keepLines/>
-        <w:spacing w:line="240" w:lineRule="auto"/>
-        <w:widowControl/>
-      </w:pPr>
-      <w:r>
-        <w:rPr>
-          <w:rFonts w:ascii="Times New Roman" w:hAnsi="Times New Roman" w:eastAsia="Times New Roman"/>
-          <w:b w:val="0"/>
-          <w:i/>
-          <w:color w:val="4E4E4E"/>
-          <w:sz w:val="20"/>
-        </w:rPr>
-        <w:t>Researcher | Co-second Author and Presenter, ICRAI 2025</w:t>
-      </w:r>
-    </w:p>
-    <w:p>
-      <w:pPr>
-        <w:pStyle w:val="CVBullet"/>
-        <w:keepNext/>
-        <w:keepLines w:val="0"/>
-        <w:spacing w:before="0" w:after="32" w:line="252" w:lineRule="auto"/>
-        <w:ind w:left="317" w:hanging="173" w:right="0"/>
-        <w:widowControl/>
-      </w:pPr>
-      <w:r>
-        <w:rPr>
-          <w:rFonts w:ascii="Times New Roman" w:hAnsi="Times New Roman" w:eastAsia="Times New Roman"/>
-          <w:b/>
-          <w:i w:val="0"/>
-          <w:color w:val="252525"/>
-          <w:sz w:val="20"/>
-        </w:rPr>
-        <w:t xml:space="preserve">• </w:t>
-      </w:r>
-      <w:r>
-        <w:rPr>
-          <w:rFonts w:ascii="Times New Roman" w:hAnsi="Times New Roman" w:eastAsia="Times New Roman"/>
-          <w:b w:val="0"/>
-          <w:i w:val="0"/>
-          <w:color w:val="252525"/>
-          <w:sz w:val="20"/>
-        </w:rPr>
-        <w:t>Constructed and cleaned a 1.1-million-pair Cantonese-English corpus through syntactic filtering, normalisation, deduplication and LaBSE-based semantic alignment.</w:t>
-      </w:r>
-    </w:p>
-    <w:p>
-      <w:pPr>
-        <w:pStyle w:val="CVBullet"/>
-        <w:keepNext w:val="0"/>
-        <w:keepLines w:val="0"/>
-        <w:spacing w:before="0" w:after="32" w:line="252" w:lineRule="auto"/>
-        <w:ind w:left="317" w:hanging="173" w:right="0"/>
-        <w:widowControl/>
-      </w:pPr>
-      <w:r>
-        <w:rPr>
-          <w:rFonts w:ascii="Times New Roman" w:hAnsi="Times New Roman" w:eastAsia="Times New Roman"/>
-          <w:b/>
-          <w:i w:val="0"/>
-          <w:color w:val="252525"/>
-          <w:sz w:val="20"/>
-        </w:rPr>
-        <w:t xml:space="preserve">• </w:t>
-      </w:r>
-      <w:r>
-        <w:rPr>
-          <w:rFonts w:ascii="Times New Roman" w:hAnsi="Times New Roman" w:eastAsia="Times New Roman"/>
-          <w:b w:val="0"/>
-          <w:i w:val="0"/>
-          <w:color w:val="252525"/>
-          <w:sz w:val="20"/>
-        </w:rPr>
-        <w:t>Fine-tuned NLLB-200-distilled-600M and designed a nested pseudo-data sampling strategy; the optimal 200k:200k pseudo-to-real setting achieved BLEU 29.63 and chrF 56.65.</w:t>
+          <w:szCs w:val="21"/>
+        </w:rPr>
+        <w:t xml:space="preserve">Medical Data Analysis / IT R&amp;D Intern · Wuhan, China</w:t>
+      </w:r>
+      <w:r>
+        <w:rPr>
+          <w:rFonts w:ascii="Times New Roman" w:hAnsi="Times New Roman" w:cs="Times New Roman"/>
+          <w:b w:val="0"/>
+          <w:i w:val="0"/>
+          <w:color w:val="1F1F1F"/>
+          <w:sz w:val="21"/>
+          <w:szCs w:val="21"/>
+        </w:rPr>
+        <w:t xml:space="preserve"> | Jan – Mar 2026</w:t>
+      </w:r>
+    </w:p>
+    <w:p>
+      <w:pPr>
+        <w:numPr>
+          <w:ilvl w:val="0"/>
+          <w:numId w:val="3"/>
+        </w:numPr>
+        <w:shd w:val="clear" w:fill="auto"/>
+        <w:spacing w:before="0" w:beforeAutospacing="0" w:after="40" w:afterAutospacing="0" w:line="247" w:lineRule="auto"/>
+        <w:ind w:left="465" w:hanging="360"/>
+        <w:jc w:val="left"/>
+        <w:widowControl w:val="1"/>
+        <w:keepLines w:val="1"/>
+      </w:pPr>
+      <w:r>
+        <w:rPr>
+          <w:rFonts w:ascii="Times New Roman" w:hAnsi="Times New Roman" w:cs="Times New Roman"/>
+          <w:b w:val="0"/>
+          <w:i w:val="0"/>
+          <w:color w:val="1F1F1F"/>
+          <w:sz w:val="22"/>
+          <w:szCs w:val="22"/>
+        </w:rPr>
+        <w:t xml:space="preserve">Used Python to process and analyse operational data, supported technical troubleshooting and contributed to internal healthcare IT workflows.</w:t>
+      </w:r>
+    </w:p>
+    <w:p>
+      <w:pPr>
+        <w:numPr>
+          <w:ilvl w:val="0"/>
+          <w:numId w:val="3"/>
+        </w:numPr>
+        <w:shd w:val="clear" w:fill="auto"/>
+        <w:spacing w:before="0" w:beforeAutospacing="0" w:after="40" w:afterAutospacing="0" w:line="247" w:lineRule="auto"/>
+        <w:ind w:left="465" w:hanging="360"/>
+        <w:jc w:val="left"/>
+        <w:widowControl w:val="1"/>
+        <w:keepLines w:val="1"/>
+      </w:pPr>
+      <w:r>
+        <w:rPr>
+          <w:rFonts w:ascii="Times New Roman" w:hAnsi="Times New Roman" w:cs="Times New Roman"/>
+          <w:b w:val="0"/>
+          <w:i w:val="0"/>
+          <w:color w:val="1F1F1F"/>
+          <w:sz w:val="22"/>
+          <w:szCs w:val="22"/>
+        </w:rPr>
+        <w:t xml:space="preserve">Evaluated AI-assisted troubleshooting and organised internal knowledge-base content for more consistent technical support.</w:t>
+      </w:r>
+    </w:p>
+    <w:p>
+      <w:pPr>
+        <w:shd w:val="clear" w:fill="auto"/>
+        <w:spacing w:after="30" w:line="247" w:lineRule="auto" w:before="70" w:beforeAutospacing="0" w:afterAutospacing="0"/>
+        <w:jc w:val="left"/>
+        <w:widowControl w:val="1"/>
+        <w:keepNext w:val="1"/>
+        <w:keepLines w:val="1"/>
+      </w:pPr>
+      <w:r>
+        <w:rPr>
+          <w:rFonts w:ascii="Times New Roman" w:hAnsi="Times New Roman" w:cs="Times New Roman"/>
+          <w:b w:val="1"/>
+          <w:i w:val="0"/>
+          <w:color w:val="1F1F1F"/>
+          <w:sz w:val="22"/>
+          <w:szCs w:val="22"/>
+        </w:rPr>
+        <w:t xml:space="preserve">Wuhan Dongfangyunjin Information Technology Co., Ltd.</w:t>
+      </w:r>
+    </w:p>
+    <w:p>
+      <w:pPr>
+        <w:shd w:val="clear" w:fill="auto"/>
+        <w:spacing w:after="50" w:line="247" w:lineRule="auto" w:before="0" w:beforeAutospacing="0" w:afterAutospacing="0"/>
+        <w:jc w:val="left"/>
+        <w:widowControl w:val="1"/>
+        <w:keepNext w:val="1"/>
+        <w:keepLines w:val="1"/>
+      </w:pPr>
+      <w:r>
+        <w:rPr>
+          <w:rFonts w:ascii="Times New Roman" w:hAnsi="Times New Roman" w:cs="Times New Roman"/>
+          <w:b w:val="0"/>
+          <w:i w:val="1"/>
+          <w:color w:val="1F1F1F"/>
+          <w:sz w:val="21"/>
+          <w:szCs w:val="21"/>
+        </w:rPr>
+        <w:t xml:space="preserve">Backend and UI Programmer (Medical Devices) · Wuhan, China</w:t>
+      </w:r>
+      <w:r>
+        <w:rPr>
+          <w:rFonts w:ascii="Times New Roman" w:hAnsi="Times New Roman" w:cs="Times New Roman"/>
+          <w:b w:val="0"/>
+          <w:i w:val="0"/>
+          <w:color w:val="1F1F1F"/>
+          <w:sz w:val="21"/>
+          <w:szCs w:val="21"/>
+        </w:rPr>
+        <w:t xml:space="preserve"> | Feb – Dec 2023</w:t>
+      </w:r>
+    </w:p>
+    <w:p>
+      <w:pPr>
+        <w:numPr>
+          <w:ilvl w:val="0"/>
+          <w:numId w:val="3"/>
+        </w:numPr>
+        <w:shd w:val="clear" w:fill="auto"/>
+        <w:spacing w:before="0" w:beforeAutospacing="0" w:after="40" w:afterAutospacing="0" w:line="247" w:lineRule="auto"/>
+        <w:ind w:left="465" w:hanging="360"/>
+        <w:jc w:val="left"/>
+        <w:widowControl w:val="1"/>
+        <w:keepLines w:val="1"/>
+      </w:pPr>
+      <w:r>
+        <w:rPr>
+          <w:rFonts w:ascii="Times New Roman" w:hAnsi="Times New Roman" w:cs="Times New Roman"/>
+          <w:b w:val="0"/>
+          <w:i w:val="0"/>
+          <w:color w:val="1F1F1F"/>
+          <w:sz w:val="22"/>
+          <w:szCs w:val="22"/>
+        </w:rPr>
+        <w:t xml:space="preserve">Developed web interfaces and external API integrations for secure data exchange and partner bidding information; implemented RBAC user management with permission and account CRUD operations.</w:t>
       </w:r>
     </w:p>
     <w:p>
       <w:pPr>
         <w:pStyle w:val="3"/>
-        <w:keepNext/>
-        <w:keepLines/>
-        <w:pageBreakBefore w:val="0"/>
+        <w:shd w:val="clear" w:fill="auto"/>
+        <w:spacing w:before="120" w:after="65" w:line="247" w:lineRule="auto" w:beforeAutospacing="0" w:afterAutospacing="0"/>
+        <w:jc w:val="left"/>
+        <w:widowControl w:val="1"/>
+        <w:keepNext w:val="1"/>
+        <w:keepLines w:val="1"/>
         <w:pBdr>
-          <w:bottom w:val="single" w:sz="5" w:space="2" w:color="6F7780"/>
+          <w:top w:val="single" w:sz="8" w:space="5" w:color="A0A0A0"/>
         </w:pBdr>
-        <w:widowControl/>
-      </w:pPr>
-      <w:r>
-        <w:t>SELECTED PUBLICATION</w:t>
-      </w:r>
-    </w:p>
-    <w:p>
-      <w:pPr>
-        <w:keepNext/>
-        <w:keepLines/>
-        <w:spacing w:after="12" w:line="240" w:lineRule="auto"/>
-        <w:widowControl/>
-      </w:pPr>
-      <w:r>
-        <w:rPr>
-          <w:rFonts w:ascii="Times New Roman" w:hAnsi="Times New Roman" w:eastAsia="Times New Roman"/>
-          <w:b w:val="0"/>
-          <w:i w:val="0"/>
-          <w:color w:val="252525"/>
-          <w:sz w:val="20"/>
-        </w:rPr>
-        <w:t>Y. Wang, Y. Gao, P. Yang, and B. Zhao, "Optimized Fine-tuning and Pseudo-Data Strategies for Cross-Domain Low-Resource Language Cantonese-English Neural Machine Translation," 11th International Conference on Robotics and Artificial Intelligence (ICRAI), Nagoya, Japan, 2025.</w:t>
-      </w:r>
-    </w:p>
-    <w:p>
-      <w:pPr>
-        <w:pStyle w:val="CVBullet"/>
-        <w:keepNext w:val="0"/>
-        <w:keepLines w:val="0"/>
-        <w:spacing w:before="0" w:after="32" w:line="252" w:lineRule="auto"/>
-        <w:ind w:left="317" w:hanging="173" w:right="0"/>
-        <w:widowControl/>
-      </w:pPr>
-      <w:r>
-        <w:rPr>
-          <w:rFonts w:ascii="Times New Roman" w:hAnsi="Times New Roman" w:eastAsia="Times New Roman"/>
-          <w:b/>
-          <w:i w:val="0"/>
-          <w:color w:val="252525"/>
-          <w:sz w:val="20"/>
-        </w:rPr>
-        <w:t xml:space="preserve">• </w:t>
-      </w:r>
-      <w:r>
-        <w:rPr>
-          <w:rFonts w:ascii="Times New Roman" w:hAnsi="Times New Roman" w:eastAsia="Times New Roman"/>
-          <w:b w:val="0"/>
-          <w:i w:val="0"/>
-          <w:color w:val="252525"/>
-          <w:sz w:val="20"/>
-        </w:rPr>
-        <w:t>Co-second author and presenter. Built and cleaned a 1.1-million-pair Cantonese-English corpus, contributed full-parameter NLLB-200-600M fine-tuning and nested pseudo-data sampling; the best in-domain setting achieved BLEU 29.63 and chrF 56.65.</w:t>
+      </w:pPr>
+      <w:r>
+        <w:rPr>
+          <w:rFonts w:ascii="Times New Roman" w:hAnsi="Times New Roman" w:cs="Times New Roman"/>
+          <w:b w:val="1"/>
+          <w:i w:val="0"/>
+          <w:color w:val="1F1F1F"/>
+          <w:sz w:val="28"/>
+          <w:szCs w:val="28"/>
+        </w:rPr>
+        <w:t xml:space="preserve">SELECTED TECHNICAL PROJECT</w:t>
+      </w:r>
+    </w:p>
+    <w:p>
+      <w:pPr>
+        <w:shd w:val="clear" w:fill="auto"/>
+        <w:spacing w:after="30" w:line="247" w:lineRule="auto" w:before="70" w:beforeAutospacing="0" w:afterAutospacing="0"/>
+        <w:jc w:val="left"/>
+        <w:widowControl w:val="1"/>
+        <w:keepNext w:val="1"/>
+        <w:keepLines w:val="1"/>
+      </w:pPr>
+      <w:r>
+        <w:rPr>
+          <w:rFonts w:ascii="Times New Roman" w:hAnsi="Times New Roman" w:cs="Times New Roman"/>
+          <w:b w:val="1"/>
+          <w:i w:val="0"/>
+          <w:color w:val="1F1F1F"/>
+          <w:sz w:val="22"/>
+          <w:szCs w:val="22"/>
+        </w:rPr>
+        <w:t xml:space="preserve">HiAgent Intelligent HR System</w:t>
+      </w:r>
+    </w:p>
+    <w:p>
+      <w:pPr>
+        <w:shd w:val="clear" w:fill="auto"/>
+        <w:spacing w:after="50" w:line="247" w:lineRule="auto" w:before="0" w:beforeAutospacing="0" w:afterAutospacing="0"/>
+        <w:jc w:val="left"/>
+        <w:widowControl w:val="1"/>
+        <w:keepNext w:val="1"/>
+        <w:keepLines w:val="1"/>
+      </w:pPr>
+      <w:r>
+        <w:rPr>
+          <w:rFonts w:ascii="Times New Roman" w:hAnsi="Times New Roman" w:cs="Times New Roman"/>
+          <w:b w:val="0"/>
+          <w:i w:val="1"/>
+          <w:color w:val="1F1F1F"/>
+          <w:sz w:val="21"/>
+          <w:szCs w:val="21"/>
+        </w:rPr>
+        <w:t xml:space="preserve">Lead Knowledge Base Engineer · XJTLU Hackathon</w:t>
+      </w:r>
+    </w:p>
+    <w:p>
+      <w:pPr>
+        <w:numPr>
+          <w:ilvl w:val="0"/>
+          <w:numId w:val="3"/>
+        </w:numPr>
+        <w:shd w:val="clear" w:fill="auto"/>
+        <w:spacing w:before="0" w:beforeAutospacing="0" w:after="40" w:afterAutospacing="0" w:line="247" w:lineRule="auto"/>
+        <w:ind w:left="465" w:hanging="360"/>
+        <w:jc w:val="left"/>
+        <w:widowControl w:val="1"/>
+        <w:keepLines w:val="1"/>
+      </w:pPr>
+      <w:r>
+        <w:rPr>
+          <w:rFonts w:ascii="Times New Roman" w:hAnsi="Times New Roman" w:cs="Times New Roman"/>
+          <w:b w:val="0"/>
+          <w:i w:val="0"/>
+          <w:color w:val="1F1F1F"/>
+          <w:sz w:val="22"/>
+          <w:szCs w:val="22"/>
+        </w:rPr>
+        <w:t xml:space="preserve">Designed a retrieval-augmented candidate-evaluation workflow; curated job descriptions, CVs and interview records for vector retrieval and LLM interpretation.</w:t>
+      </w:r>
+    </w:p>
+    <w:p>
+      <w:pPr>
+        <w:numPr>
+          <w:ilvl w:val="0"/>
+          <w:numId w:val="3"/>
+        </w:numPr>
+        <w:shd w:val="clear" w:fill="auto"/>
+        <w:spacing w:before="0" w:beforeAutospacing="0" w:after="40" w:afterAutospacing="0" w:line="247" w:lineRule="auto"/>
+        <w:ind w:left="465" w:hanging="360"/>
+        <w:jc w:val="left"/>
+        <w:widowControl w:val="1"/>
+        <w:keepLines w:val="1"/>
+      </w:pPr>
+      <w:r>
+        <w:rPr>
+          <w:rFonts w:ascii="Times New Roman" w:hAnsi="Times New Roman" w:cs="Times New Roman"/>
+          <w:b w:val="0"/>
+          <w:i w:val="0"/>
+          <w:color w:val="1F1F1F"/>
+          <w:sz w:val="22"/>
+          <w:szCs w:val="22"/>
+        </w:rPr>
+        <w:t xml:space="preserve">Integrated PDF/Word parsing with job-description analysis, candidate scoring and dynamic interview-question generation.</w:t>
       </w:r>
     </w:p>
     <w:p>
       <w:pPr>
         <w:pStyle w:val="3"/>
-        <w:keepNext/>
-        <w:keepLines/>
-        <w:pageBreakBefore w:val="0"/>
+        <w:shd w:val="clear" w:fill="auto"/>
+        <w:spacing w:before="120" w:after="65" w:line="247" w:lineRule="auto" w:beforeAutospacing="0" w:afterAutospacing="0"/>
+        <w:jc w:val="left"/>
+        <w:widowControl w:val="1"/>
+        <w:keepNext w:val="1"/>
+        <w:keepLines w:val="1"/>
         <w:pBdr>
-          <w:bottom w:val="single" w:sz="5" w:space="2" w:color="6F7780"/>
+          <w:top w:val="single" w:sz="8" w:space="5" w:color="A0A0A0"/>
         </w:pBdr>
-        <w:widowControl/>
-        <w:spacing w:before="200" w:after="96"/>
-      </w:pPr>
-      <w:r>
-        <w:t>PROFESSIONAL EXPERIENCE</w:t>
-      </w:r>
-    </w:p>
-    <w:p>
-      <w:pPr>
-        <w:keepNext/>
-        <w:keepLines/>
-        <w:spacing w:before="24" w:after="46" w:line="259" w:lineRule="auto"/>
-        <w:widowControl/>
-      </w:pPr>
-      <w:r>
-        <w:rPr>
-          <w:rFonts w:ascii="Times New Roman" w:hAnsi="Times New Roman"/>
-          <w:b/>
-          <w:i w:val="0"/>
+      </w:pPr>
+      <w:r>
+        <w:rPr>
+          <w:rFonts w:ascii="Times New Roman" w:hAnsi="Times New Roman" w:cs="Times New Roman"/>
+          <w:b w:val="1"/>
+          <w:i w:val="0"/>
+          <w:color w:val="1F1F1F"/>
+          <w:sz w:val="28"/>
+          <w:szCs w:val="28"/>
+        </w:rPr>
+        <w:t xml:space="preserve">TECHNICAL SKILLS</w:t>
+      </w:r>
+    </w:p>
+    <w:p>
+      <w:pPr>
+        <w:shd w:val="clear" w:fill="auto"/>
+        <w:spacing w:after="45" w:line="247" w:lineRule="auto" w:before="0" w:beforeAutospacing="0" w:afterAutospacing="0"/>
+        <w:jc w:val="left"/>
+        <w:widowControl w:val="1"/>
+        <w:keepLines w:val="1"/>
+      </w:pPr>
+      <w:r>
+        <w:rPr>
+          <w:rFonts w:ascii="Times New Roman" w:hAnsi="Times New Roman" w:cs="Times New Roman"/>
+          <w:b w:val="0"/>
+          <w:i w:val="0"/>
+          <w:color w:val="1F1F1F"/>
+          <w:sz w:val="22"/>
+          <w:szCs w:val="22"/>
+        </w:rPr>
+        <w:t xml:space="preserve"/>
+      </w:r>
+      <w:r>
+        <w:rPr>
+          <w:rFonts w:ascii="Times New Roman" w:hAnsi="Times New Roman" w:cs="Times New Roman"/>
+          <w:b w:val="1"/>
+          <w:i w:val="0"/>
+          <w:color w:val="1F1F1F"/>
+          <w:sz w:val="22"/>
+          <w:szCs w:val="22"/>
+        </w:rPr>
+        <w:t xml:space="preserve">Research and ML  </w:t>
+      </w:r>
+      <w:r>
+        <w:rPr>
+          <w:rFonts w:ascii="Times New Roman" w:hAnsi="Times New Roman" w:cs="Times New Roman"/>
+          <w:b w:val="0"/>
+          <w:i w:val="0"/>
+          <w:color w:val="1F1F1F"/>
+          <w:sz w:val="22"/>
+          <w:szCs w:val="22"/>
+        </w:rPr>
+        <w:t xml:space="preserve">Python, PyTorch, model profiling, workload tracing, reproducible experiments, NLLB/LLM fine-tuning.</w:t>
+      </w:r>
+    </w:p>
+    <w:p>
+      <w:pPr>
+        <w:shd w:val="clear" w:fill="auto"/>
+        <w:spacing w:after="45" w:line="247" w:lineRule="auto" w:before="0" w:beforeAutospacing="0" w:afterAutospacing="0"/>
+        <w:jc w:val="left"/>
+        <w:widowControl w:val="1"/>
+        <w:keepLines w:val="1"/>
+      </w:pPr>
+      <w:r>
+        <w:rPr>
+          <w:rFonts w:ascii="Times New Roman" w:hAnsi="Times New Roman" w:cs="Times New Roman"/>
+          <w:b w:val="0"/>
+          <w:i w:val="0"/>
+          <w:color w:val="1F1F1F"/>
+          <w:sz w:val="22"/>
+          <w:szCs w:val="22"/>
+        </w:rPr>
+        <w:t xml:space="preserve"/>
+      </w:r>
+      <w:r>
+        <w:rPr>
+          <w:rFonts w:ascii="Times New Roman" w:hAnsi="Times New Roman" w:cs="Times New Roman"/>
+          <w:b w:val="1"/>
+          <w:i w:val="0"/>
+          <w:color w:val="1F1F1F"/>
+          <w:sz w:val="22"/>
+          <w:szCs w:val="22"/>
+        </w:rPr>
+        <w:t xml:space="preserve">AI systems and hardware  </w:t>
+      </w:r>
+      <w:r>
+        <w:rPr>
+          <w:rFonts w:ascii="Times New Roman" w:hAnsi="Times New Roman" w:cs="Times New Roman"/>
+          <w:b w:val="0"/>
+          <w:i w:val="0"/>
+          <w:color w:val="1F1F1F"/>
+          <w:sz w:val="22"/>
+          <w:szCs w:val="22"/>
+        </w:rPr>
+        <w:t xml:space="preserve">LPWM, world models, LLMCompass, SimPhony, microring-resonator photonic computing, hybrid photonic–electronic architectures.</w:t>
+      </w:r>
+    </w:p>
+    <w:p>
+      <w:pPr>
+        <w:shd w:val="clear" w:fill="auto"/>
+        <w:spacing w:after="45" w:line="247" w:lineRule="auto" w:before="0" w:beforeAutospacing="0" w:afterAutospacing="0"/>
+        <w:jc w:val="left"/>
+        <w:widowControl w:val="1"/>
+        <w:keepLines w:val="1"/>
+      </w:pPr>
+      <w:r>
+        <w:rPr>
+          <w:rFonts w:ascii="Times New Roman" w:hAnsi="Times New Roman" w:cs="Times New Roman"/>
+          <w:b w:val="0"/>
+          <w:i w:val="0"/>
+          <w:color w:val="1F1F1F"/>
+          <w:sz w:val="22"/>
+          <w:szCs w:val="22"/>
+        </w:rPr>
+        <w:t xml:space="preserve"/>
+      </w:r>
+      <w:r>
+        <w:rPr>
+          <w:rFonts w:ascii="Times New Roman" w:hAnsi="Times New Roman" w:cs="Times New Roman"/>
+          <w:b w:val="1"/>
+          <w:i w:val="0"/>
+          <w:color w:val="1F1F1F"/>
+          <w:sz w:val="22"/>
+          <w:szCs w:val="22"/>
+        </w:rPr>
+        <w:t xml:space="preserve">Robotics and security  </w:t>
+      </w:r>
+      <w:r>
+        <w:rPr>
+          <w:rFonts w:ascii="Times New Roman" w:hAnsi="Times New Roman" w:cs="Times New Roman"/>
+          <w:b w:val="0"/>
+          <w:i w:val="0"/>
+          <w:color w:val="1F1F1F"/>
+          <w:sz w:val="22"/>
+          <w:szCs w:val="22"/>
+        </w:rPr>
+        <w:t xml:space="preserve">ROS 2, PX4 SITL, Gazebo, Solidity, Hardhat, ethers.js, blockchain and permissioned-ledger prototyping.</w:t>
+      </w:r>
+    </w:p>
+    <w:p>
+      <w:pPr>
+        <w:shd w:val="clear" w:fill="auto"/>
+        <w:spacing w:after="45" w:line="247" w:lineRule="auto" w:before="0" w:beforeAutospacing="0" w:afterAutospacing="0"/>
+        <w:jc w:val="left"/>
+        <w:widowControl w:val="1"/>
+        <w:keepLines w:val="1"/>
+      </w:pPr>
+      <w:r>
+        <w:rPr>
+          <w:rFonts w:ascii="Times New Roman" w:hAnsi="Times New Roman" w:cs="Times New Roman"/>
+          <w:b w:val="0"/>
+          <w:i w:val="0"/>
+          <w:color w:val="1F1F1F"/>
+          <w:sz w:val="22"/>
+          <w:szCs w:val="22"/>
+        </w:rPr>
+        <w:t xml:space="preserve"/>
+      </w:r>
+      <w:r>
+        <w:rPr>
+          <w:rFonts w:ascii="Times New Roman" w:hAnsi="Times New Roman" w:cs="Times New Roman"/>
+          <w:b w:val="1"/>
+          <w:i w:val="0"/>
+          <w:color w:val="1F1F1F"/>
+          <w:sz w:val="22"/>
+          <w:szCs w:val="22"/>
+        </w:rPr>
+        <w:t xml:space="preserve">Software  </w:t>
+      </w:r>
+      <w:r>
+        <w:rPr>
+          <w:rFonts w:ascii="Times New Roman" w:hAnsi="Times New Roman" w:cs="Times New Roman"/>
+          <w:b w:val="0"/>
+          <w:i w:val="0"/>
+          <w:color w:val="1F1F1F"/>
+          <w:sz w:val="22"/>
+          <w:szCs w:val="22"/>
+        </w:rPr>
+        <w:t xml:space="preserve">Git, Linux, Java, SQL, REST APIs, LaTeX.</w:t>
+      </w:r>
+    </w:p>
+    <w:p>
+      <w:pPr>
+        <w:pStyle w:val="3"/>
+        <w:shd w:val="clear" w:fill="auto"/>
+        <w:spacing w:before="120" w:after="65" w:line="247" w:lineRule="auto" w:beforeAutospacing="0" w:afterAutospacing="0"/>
+        <w:jc w:val="left"/>
+        <w:widowControl w:val="1"/>
+        <w:keepNext w:val="1"/>
+        <w:keepLines w:val="1"/>
+        <w:pBdr>
+          <w:top w:val="single" w:sz="8" w:space="5" w:color="A0A0A0"/>
+        </w:pBdr>
+      </w:pPr>
+      <w:r>
+        <w:rPr>
+          <w:rFonts w:ascii="Times New Roman" w:hAnsi="Times New Roman" w:cs="Times New Roman"/>
+          <w:b w:val="1"/>
+          <w:i w:val="0"/>
+          <w:color w:val="1F1F1F"/>
+          <w:sz w:val="28"/>
+          <w:szCs w:val="28"/>
+        </w:rPr>
+        <w:t xml:space="preserve">ADDITIONAL TRAINING AND HONOURS</w:t>
+      </w:r>
+    </w:p>
+    <w:p>
+      <w:pPr>
+        <w:shd w:val="clear" w:fill="auto"/>
+        <w:spacing w:after="30" w:line="247" w:lineRule="auto" w:before="70" w:beforeAutospacing="0" w:afterAutospacing="0"/>
+        <w:jc w:val="left"/>
+        <w:widowControl w:val="1"/>
+        <w:keepNext w:val="1"/>
+        <w:keepLines w:val="1"/>
+      </w:pPr>
+      <w:r>
+        <w:rPr>
+          <w:rFonts w:ascii="Times New Roman" w:hAnsi="Times New Roman" w:cs="Times New Roman"/>
+          <w:b w:val="1"/>
+          <w:i w:val="0"/>
+          <w:color w:val="1F1F1F"/>
+          <w:sz w:val="22"/>
+          <w:szCs w:val="22"/>
+        </w:rPr>
+        <w:t xml:space="preserve">CEAIE Innovative Talents Science Training Programme</w:t>
+      </w:r>
+    </w:p>
+    <w:p>
+      <w:pPr>
+        <w:shd w:val="clear" w:fill="auto"/>
+        <w:spacing w:after="50" w:line="247" w:lineRule="auto" w:before="0" w:beforeAutospacing="0" w:afterAutospacing="0"/>
+        <w:jc w:val="left"/>
+        <w:widowControl w:val="1"/>
+        <w:keepNext w:val="1"/>
+        <w:keepLines w:val="1"/>
+      </w:pPr>
+      <w:r>
+        <w:rPr>
+          <w:rFonts w:ascii="Times New Roman" w:hAnsi="Times New Roman" w:cs="Times New Roman"/>
+          <w:b w:val="0"/>
+          <w:i w:val="1"/>
+          <w:color w:val="1F1F1F"/>
           <w:sz w:val="21"/>
-        </w:rPr>
-        <w:t>Research Institute of Tsinghua University in Shenzhen (RITS) | Shenzhen, China</w:t>
-      </w:r>
-      <w:r>
-        <w:rPr>
-          <w:rFonts w:ascii="Times New Roman" w:hAnsi="Times New Roman"/>
-          <w:b/>
-          <w:i w:val="0"/>
-          <w:sz w:val="20"/>
-        </w:rPr>
-        <w:t xml:space="preserve"> | May 2026 - Jul 2026</w:t>
-      </w:r>
-    </w:p>
-    <w:p>
-      <w:pPr>
-        <w:pStyle w:val="CVRole"/>
-        <w:keepNext/>
-        <w:keepLines/>
-        <w:spacing w:line="250" w:lineRule="auto" w:after="48"/>
-        <w:widowControl/>
-      </w:pPr>
-      <w:r>
-        <w:rPr>
-          <w:rFonts w:ascii="Times New Roman" w:hAnsi="Times New Roman"/>
-          <w:b w:val="0"/>
-          <w:i/>
-          <w:sz w:val="20"/>
-        </w:rPr>
-        <w:t>Research and Development Intern, Marine Hydrogen Energy R&amp;D Center</w:t>
-      </w:r>
-    </w:p>
-    <w:p>
-      <w:pPr>
-        <w:pStyle w:val="CVBullet"/>
-        <w:keepNext/>
-        <w:keepLines w:val="0"/>
-        <w:spacing w:before="0" w:after="54" w:line="264" w:lineRule="auto"/>
-        <w:ind w:left="317" w:hanging="173" w:right="0"/>
-        <w:widowControl/>
-      </w:pPr>
-      <w:r>
-        <w:rPr>
-          <w:rFonts w:ascii="Times New Roman" w:hAnsi="Times New Roman"/>
-          <w:b/>
-          <w:i w:val="0"/>
-          <w:sz w:val="20"/>
-        </w:rPr>
-        <w:t xml:space="preserve">• </w:t>
-      </w:r>
-      <w:r>
-        <w:rPr>
-          <w:rFonts w:ascii="Times New Roman" w:hAnsi="Times New Roman"/>
-          <w:b w:val="0"/>
-          <w:i w:val="0"/>
-          <w:sz w:val="20"/>
-        </w:rPr>
-        <w:t>Completed a two-month R&amp;D placement in the Marine Hydrogen Energy R&amp;D Center; commended in the official internship certificate for initiative, collaboration and strong overall performance.</w:t>
-      </w:r>
-    </w:p>
-    <w:p>
-      <w:pPr>
-        <w:keepNext/>
-        <w:keepLines/>
-        <w:spacing w:before="24" w:after="46" w:line="259" w:lineRule="auto"/>
-        <w:widowControl/>
-      </w:pPr>
-      <w:r>
-        <w:rPr>
-          <w:rFonts w:ascii="Times New Roman" w:hAnsi="Times New Roman" w:eastAsia="Times New Roman"/>
-          <w:b/>
-          <w:i w:val="0"/>
-          <w:color w:val="252525"/>
+          <w:szCs w:val="21"/>
+        </w:rPr>
+        <w:t xml:space="preserve">Machine Learning, Network Security and Large Language Models</w:t>
+      </w:r>
+      <w:r>
+        <w:rPr>
+          <w:rFonts w:ascii="Times New Roman" w:hAnsi="Times New Roman" w:cs="Times New Roman"/>
+          <w:b w:val="0"/>
+          <w:i w:val="0"/>
+          <w:color w:val="1F1F1F"/>
           <w:sz w:val="21"/>
-        </w:rPr>
-        <w:t>Wuhan University City Hospital Co., Ltd. | Wuhan, China</w:t>
-      </w:r>
-      <w:r>
-        <w:rPr>
-          <w:rFonts w:ascii="Times New Roman" w:hAnsi="Times New Roman" w:eastAsia="Times New Roman"/>
-          <w:b/>
-          <w:i w:val="0"/>
-          <w:color w:val="4E4E4E"/>
-          <w:sz w:val="20"/>
-        </w:rPr>
-        <w:t xml:space="preserve"> | Jan 2026 - Mar 2026</w:t>
-      </w:r>
-    </w:p>
-    <w:p>
-      <w:pPr>
-        <w:pStyle w:val="CVRole"/>
-        <w:keepNext/>
-        <w:keepLines/>
-        <w:spacing w:line="250" w:lineRule="auto" w:after="48"/>
-        <w:widowControl/>
-      </w:pPr>
-      <w:r>
-        <w:rPr>
-          <w:rFonts w:ascii="Times New Roman" w:hAnsi="Times New Roman" w:eastAsia="Times New Roman"/>
-          <w:b w:val="0"/>
-          <w:i/>
-          <w:color w:val="4E4E4E"/>
-          <w:sz w:val="20"/>
-        </w:rPr>
-        <w:t>Medical Data Analysis / IT R&amp;D Intern</w:t>
-      </w:r>
-    </w:p>
-    <w:p>
-      <w:pPr>
-        <w:pStyle w:val="CVBullet"/>
-        <w:keepNext/>
-        <w:keepLines w:val="0"/>
-        <w:spacing w:before="0" w:after="54" w:line="264" w:lineRule="auto"/>
-        <w:ind w:left="317" w:hanging="173" w:right="0"/>
-        <w:widowControl/>
-      </w:pPr>
-      <w:r>
-        <w:rPr>
-          <w:rFonts w:ascii="Times New Roman" w:hAnsi="Times New Roman" w:eastAsia="Times New Roman"/>
-          <w:b/>
-          <w:i w:val="0"/>
-          <w:color w:val="252525"/>
-          <w:sz w:val="20"/>
-        </w:rPr>
-        <w:t xml:space="preserve">• </w:t>
-      </w:r>
-      <w:r>
-        <w:rPr>
-          <w:rFonts w:ascii="Times New Roman" w:hAnsi="Times New Roman" w:eastAsia="Times New Roman"/>
-          <w:b w:val="0"/>
-          <w:i w:val="0"/>
-          <w:color w:val="252525"/>
-          <w:sz w:val="20"/>
-        </w:rPr>
-        <w:t>Applied Python to process and analyse operational data, supported technical troubleshooting, and contributed to improving internal healthcare IT workflows.</w:t>
-      </w:r>
-    </w:p>
-    <w:p>
-      <w:pPr>
-        <w:pStyle w:val="CVBullet"/>
-        <w:keepNext w:val="0"/>
-        <w:keepLines w:val="0"/>
-        <w:spacing w:before="0" w:after="54" w:line="264" w:lineRule="auto"/>
-        <w:ind w:left="317" w:hanging="173" w:right="0"/>
-        <w:widowControl/>
-      </w:pPr>
-      <w:r>
-        <w:rPr>
-          <w:rFonts w:ascii="Times New Roman" w:hAnsi="Times New Roman" w:eastAsia="Times New Roman"/>
-          <w:b/>
-          <w:i w:val="0"/>
-          <w:color w:val="252525"/>
-          <w:sz w:val="20"/>
-        </w:rPr>
-        <w:t xml:space="preserve">• </w:t>
-      </w:r>
-      <w:r>
-        <w:rPr>
-          <w:rFonts w:ascii="Times New Roman" w:hAnsi="Times New Roman" w:eastAsia="Times New Roman"/>
-          <w:b w:val="0"/>
-          <w:i w:val="0"/>
-          <w:color w:val="252525"/>
-          <w:sz w:val="20"/>
-        </w:rPr>
-        <w:t>Evaluated AI-assisted troubleshooting methods and helped organise internal knowledge-base content for more consistent technical support.</w:t>
-      </w:r>
-    </w:p>
-    <w:p>
-      <w:pPr>
-        <w:keepNext/>
-        <w:keepLines/>
-        <w:spacing w:before="24" w:after="46" w:line="259" w:lineRule="auto"/>
-        <w:widowControl/>
-      </w:pPr>
-      <w:r>
-        <w:rPr>
-          <w:rFonts w:ascii="Times New Roman" w:hAnsi="Times New Roman" w:eastAsia="Times New Roman"/>
-          <w:b/>
-          <w:i w:val="0"/>
-          <w:color w:val="252525"/>
-          <w:sz w:val="21"/>
-        </w:rPr>
-        <w:t>Wuhan Dongfangyunjin Information Technology Co., Ltd. | Wuhan, China</w:t>
-      </w:r>
-      <w:r>
-        <w:rPr>
-          <w:rFonts w:ascii="Times New Roman" w:hAnsi="Times New Roman" w:eastAsia="Times New Roman"/>
-          <w:b/>
-          <w:i w:val="0"/>
-          <w:color w:val="4E4E4E"/>
-          <w:sz w:val="20"/>
-        </w:rPr>
-        <w:t xml:space="preserve"> | Feb 2023 - Dec 2023</w:t>
-      </w:r>
-    </w:p>
-    <w:p>
-      <w:pPr>
-        <w:pStyle w:val="CVRole"/>
-        <w:keepNext/>
-        <w:keepLines/>
-        <w:spacing w:line="250" w:lineRule="auto" w:after="48"/>
-        <w:widowControl/>
-      </w:pPr>
-      <w:r>
-        <w:rPr>
-          <w:rFonts w:ascii="Times New Roman" w:hAnsi="Times New Roman" w:eastAsia="Times New Roman"/>
-          <w:b w:val="0"/>
-          <w:i/>
-          <w:color w:val="4E4E4E"/>
-          <w:sz w:val="20"/>
-        </w:rPr>
-        <w:t>Backend and UI Programmer (Medical Devices)</w:t>
-      </w:r>
-    </w:p>
-    <w:p>
-      <w:pPr>
-        <w:pStyle w:val="CVBullet"/>
-        <w:keepNext/>
-        <w:keepLines w:val="0"/>
-        <w:spacing w:before="0" w:after="54" w:line="264" w:lineRule="auto"/>
-        <w:ind w:left="317" w:hanging="173" w:right="0"/>
-        <w:widowControl/>
-      </w:pPr>
-      <w:r>
-        <w:rPr>
-          <w:rFonts w:ascii="Times New Roman" w:hAnsi="Times New Roman" w:eastAsia="Times New Roman"/>
-          <w:b/>
-          <w:i w:val="0"/>
-          <w:color w:val="252525"/>
-          <w:sz w:val="20"/>
-        </w:rPr>
-        <w:t xml:space="preserve">• </w:t>
-      </w:r>
-      <w:r>
-        <w:rPr>
-          <w:rFonts w:ascii="Times New Roman" w:hAnsi="Times New Roman" w:eastAsia="Times New Roman"/>
-          <w:b w:val="0"/>
-          <w:i w:val="0"/>
-          <w:color w:val="252525"/>
-          <w:sz w:val="20"/>
-        </w:rPr>
-        <w:t>Developed web interfaces and external API integrations supporting secure data exchange and collection of partner bidding information.</w:t>
-      </w:r>
-    </w:p>
-    <w:p>
-      <w:pPr>
-        <w:pStyle w:val="CVBullet"/>
-        <w:keepNext w:val="0"/>
-        <w:keepLines w:val="0"/>
-        <w:spacing w:before="0" w:after="54" w:line="264" w:lineRule="auto"/>
-        <w:ind w:left="317" w:hanging="173" w:right="0"/>
-        <w:widowControl/>
-      </w:pPr>
-      <w:r>
-        <w:rPr>
-          <w:rFonts w:ascii="Times New Roman" w:hAnsi="Times New Roman" w:eastAsia="Times New Roman"/>
-          <w:b/>
-          <w:i w:val="0"/>
-          <w:color w:val="252525"/>
-          <w:sz w:val="20"/>
-        </w:rPr>
-        <w:t xml:space="preserve">• </w:t>
-      </w:r>
-      <w:r>
-        <w:rPr>
-          <w:rFonts w:ascii="Times New Roman" w:hAnsi="Times New Roman" w:eastAsia="Times New Roman"/>
-          <w:b w:val="0"/>
-          <w:i w:val="0"/>
-          <w:color w:val="252525"/>
-          <w:sz w:val="20"/>
-        </w:rPr>
-        <w:t>Implemented an RBAC user-management module enabling administrators to perform controlled permission and account CRUD operations.</w:t>
-      </w:r>
-    </w:p>
-    <w:p>
-      <w:pPr>
-        <w:pStyle w:val="3"/>
-        <w:keepNext/>
-        <w:keepLines/>
-        <w:pageBreakBefore w:val="0"/>
-        <w:pBdr>
-          <w:bottom w:val="single" w:sz="5" w:space="2" w:color="6F7780"/>
-        </w:pBdr>
-        <w:widowControl/>
-        <w:spacing w:before="200" w:after="96"/>
-      </w:pPr>
-      <w:r>
-        <w:t>SELECTED TECHNICAL PROJECT</w:t>
-      </w:r>
-    </w:p>
-    <w:p>
-      <w:pPr>
-        <w:keepNext/>
-        <w:keepLines/>
-        <w:spacing w:before="24" w:after="46" w:line="259" w:lineRule="auto"/>
-        <w:widowControl/>
-      </w:pPr>
-      <w:r>
-        <w:rPr>
-          <w:rFonts w:ascii="Times New Roman" w:hAnsi="Times New Roman" w:eastAsia="Times New Roman"/>
-          <w:b/>
-          <w:i w:val="0"/>
-          <w:color w:val="252525"/>
-          <w:sz w:val="21"/>
-        </w:rPr>
-        <w:t>HiAgent Intelligent HR System | XJTLU Hackathon</w:t>
-      </w:r>
-    </w:p>
-    <w:p>
-      <w:pPr>
-        <w:pStyle w:val="CVRole"/>
-        <w:keepNext/>
-        <w:keepLines/>
-        <w:spacing w:line="250" w:lineRule="auto" w:after="48"/>
-        <w:widowControl/>
-      </w:pPr>
-      <w:r>
-        <w:rPr>
-          <w:rFonts w:ascii="Times New Roman" w:hAnsi="Times New Roman" w:eastAsia="Times New Roman"/>
-          <w:b w:val="0"/>
-          <w:i/>
-          <w:color w:val="4E4E4E"/>
-          <w:sz w:val="20"/>
-        </w:rPr>
-        <w:t>Lead Knowledge Base Engineer</w:t>
-      </w:r>
-    </w:p>
-    <w:p>
-      <w:pPr>
-        <w:pStyle w:val="CVBullet"/>
-        <w:keepNext/>
-        <w:keepLines w:val="0"/>
-        <w:spacing w:before="0" w:after="54" w:line="264" w:lineRule="auto"/>
-        <w:ind w:left="317" w:hanging="173" w:right="0"/>
-        <w:widowControl/>
-      </w:pPr>
-      <w:r>
-        <w:rPr>
-          <w:rFonts w:ascii="Times New Roman" w:hAnsi="Times New Roman" w:eastAsia="Times New Roman"/>
-          <w:b/>
-          <w:i w:val="0"/>
-          <w:color w:val="252525"/>
-          <w:sz w:val="20"/>
-        </w:rPr>
-        <w:t xml:space="preserve">• </w:t>
-      </w:r>
-      <w:r>
-        <w:rPr>
-          <w:rFonts w:ascii="Times New Roman" w:hAnsi="Times New Roman" w:eastAsia="Times New Roman"/>
-          <w:b w:val="0"/>
-          <w:i w:val="0"/>
-          <w:color w:val="252525"/>
-          <w:sz w:val="20"/>
-        </w:rPr>
-        <w:t>Designed a retrieval-augmented candidate-evaluation workflow, curated and tagged job descriptions, resumes and interview records for optimised vector retrieval and LLM interpretation.</w:t>
-      </w:r>
-    </w:p>
-    <w:p>
-      <w:pPr>
-        <w:pStyle w:val="CVBullet"/>
-        <w:keepNext w:val="0"/>
-        <w:keepLines w:val="0"/>
-        <w:spacing w:before="0" w:after="54" w:line="264" w:lineRule="auto"/>
-        <w:ind w:left="317" w:hanging="173" w:right="0"/>
-        <w:widowControl/>
-      </w:pPr>
-      <w:r>
-        <w:rPr>
-          <w:rFonts w:ascii="Times New Roman" w:hAnsi="Times New Roman" w:eastAsia="Times New Roman"/>
-          <w:b/>
-          <w:i w:val="0"/>
-          <w:color w:val="252525"/>
-          <w:sz w:val="20"/>
-        </w:rPr>
-        <w:t xml:space="preserve">• </w:t>
-      </w:r>
-      <w:r>
-        <w:rPr>
-          <w:rFonts w:ascii="Times New Roman" w:hAnsi="Times New Roman" w:eastAsia="Times New Roman"/>
-          <w:b w:val="0"/>
-          <w:i w:val="0"/>
-          <w:color w:val="252525"/>
-          <w:sz w:val="20"/>
-        </w:rPr>
-        <w:t>Integrated PDF/Word parsing and orchestrated an end-to-end workflow linking job-description analysis, resume parsing, candidate scoring and dynamic interview-question generation.</w:t>
-      </w:r>
-    </w:p>
-    <w:p>
-      <w:pPr>
-        <w:pStyle w:val="3"/>
-        <w:keepNext/>
-        <w:keepLines/>
-        <w:pageBreakBefore w:val="0"/>
-        <w:pBdr>
-          <w:bottom w:val="single" w:sz="5" w:space="2" w:color="6F7780"/>
-        </w:pBdr>
-        <w:widowControl/>
-        <w:spacing w:before="200" w:after="96"/>
-      </w:pPr>
-      <w:r>
-        <w:t>TECHNICAL SKILLS</w:t>
-      </w:r>
-    </w:p>
-    <w:p>
-      <w:pPr>
-        <w:keepNext w:val="0"/>
-        <w:keepLines w:val="0"/>
-        <w:spacing w:before="0" w:after="46" w:line="259" w:lineRule="auto"/>
-        <w:widowControl/>
-      </w:pPr>
-      <w:r>
-        <w:rPr>
-          <w:rFonts w:ascii="Times New Roman" w:hAnsi="Times New Roman" w:eastAsia="Times New Roman"/>
-          <w:b/>
-          <w:i w:val="0"/>
-          <w:color w:val="252525"/>
-          <w:sz w:val="20"/>
-        </w:rPr>
-        <w:t xml:space="preserve">Research and ML: </w:t>
-      </w:r>
-      <w:r>
-        <w:rPr>
-          <w:rFonts w:ascii="Times New Roman" w:hAnsi="Times New Roman" w:eastAsia="Times New Roman"/>
-          <w:b w:val="0"/>
-          <w:i w:val="0"/>
-          <w:color w:val="252525"/>
-          <w:sz w:val="20"/>
-        </w:rPr>
-        <w:t>Python, PyTorch, model profiling, workload tracing, reproducible experimentation, NLLB/LLM fine-tuning.</w:t>
-      </w:r>
-    </w:p>
-    <w:p>
-      <w:pPr>
-        <w:keepNext w:val="0"/>
-        <w:keepLines w:val="0"/>
-        <w:spacing w:before="0" w:after="46" w:line="259" w:lineRule="auto"/>
-        <w:widowControl/>
-      </w:pPr>
-      <w:r>
-        <w:rPr>
-          <w:rFonts w:ascii="Times New Roman" w:hAnsi="Times New Roman" w:eastAsia="Times New Roman"/>
-          <w:b/>
-          <w:i w:val="0"/>
-          <w:color w:val="252525"/>
-          <w:sz w:val="20"/>
-        </w:rPr>
-        <w:t xml:space="preserve">AI systems and hardware: </w:t>
-      </w:r>
-      <w:r>
-        <w:rPr>
-          <w:rFonts w:ascii="Times New Roman" w:hAnsi="Times New Roman" w:eastAsia="Times New Roman"/>
-          <w:b w:val="0"/>
-          <w:i w:val="0"/>
-          <w:color w:val="252525"/>
-          <w:sz w:val="20"/>
-        </w:rPr>
-        <w:t>LPWM and world models, LLMCompass, SimPhony, microring-resonator photonic computing, hybrid photonic-electronic architectures.</w:t>
-      </w:r>
-    </w:p>
-    <w:p>
-      <w:pPr>
-        <w:keepNext w:val="0"/>
-        <w:keepLines w:val="0"/>
-        <w:spacing w:before="0" w:after="46" w:line="259" w:lineRule="auto"/>
-        <w:widowControl/>
-      </w:pPr>
-      <w:r>
-        <w:rPr>
-          <w:rFonts w:ascii="Times New Roman" w:hAnsi="Times New Roman" w:eastAsia="Times New Roman"/>
-          <w:b/>
-          <w:i w:val="0"/>
-          <w:color w:val="252525"/>
-          <w:sz w:val="20"/>
-        </w:rPr>
-        <w:t xml:space="preserve">Robotics and security: </w:t>
-      </w:r>
-      <w:r>
-        <w:rPr>
-          <w:rFonts w:ascii="Times New Roman" w:hAnsi="Times New Roman" w:eastAsia="Times New Roman"/>
-          <w:b w:val="0"/>
-          <w:i w:val="0"/>
-          <w:color w:val="252525"/>
-          <w:sz w:val="20"/>
-        </w:rPr>
-        <w:t>ROS 2, PX4 SITL, Gazebo, Solidity, Hardhat, ethers.js, blockchain and permissioned-ledger prototyping.</w:t>
-      </w:r>
-    </w:p>
-    <w:p>
-      <w:pPr>
-        <w:keepNext w:val="0"/>
-        <w:keepLines w:val="0"/>
-        <w:spacing w:before="0" w:after="46" w:line="259" w:lineRule="auto"/>
-        <w:widowControl/>
-      </w:pPr>
-      <w:r>
-        <w:rPr>
-          <w:rFonts w:ascii="Times New Roman" w:hAnsi="Times New Roman" w:eastAsia="Times New Roman"/>
-          <w:b/>
-          <w:i w:val="0"/>
-          <w:color w:val="252525"/>
-          <w:sz w:val="20"/>
-        </w:rPr>
-        <w:t xml:space="preserve">Software: </w:t>
-      </w:r>
-      <w:r>
-        <w:rPr>
-          <w:rFonts w:ascii="Times New Roman" w:hAnsi="Times New Roman" w:eastAsia="Times New Roman"/>
-          <w:b w:val="0"/>
-          <w:i w:val="0"/>
-          <w:color w:val="252525"/>
-          <w:sz w:val="20"/>
-        </w:rPr>
-        <w:t>Git, Linux, Java, SQL, REST APIs, LaTeX.</w:t>
-      </w:r>
-    </w:p>
-    <w:p>
-      <w:pPr>
-        <w:pStyle w:val="3"/>
-        <w:keepNext/>
-        <w:keepLines/>
-        <w:pageBreakBefore w:val="0"/>
-        <w:pBdr>
-          <w:bottom w:val="single" w:sz="5" w:space="2" w:color="6F7780"/>
-        </w:pBdr>
-        <w:widowControl/>
-        <w:spacing w:before="200" w:after="96"/>
-      </w:pPr>
-      <w:r>
-        <w:t>SELECTED HONOURS</w:t>
-      </w:r>
-    </w:p>
-    <w:p>
-      <w:pPr>
-        <w:pStyle w:val="CVBullet"/>
-        <w:keepNext w:val="0"/>
-        <w:keepLines w:val="0"/>
-        <w:spacing w:before="0" w:after="54" w:line="264" w:lineRule="auto"/>
-        <w:ind w:left="317" w:hanging="173" w:right="0"/>
-        <w:widowControl/>
-      </w:pPr>
-      <w:r>
-        <w:rPr>
-          <w:rFonts w:ascii="Times New Roman" w:hAnsi="Times New Roman" w:eastAsia="Times New Roman"/>
-          <w:b/>
-          <w:i w:val="0"/>
-          <w:color w:val="252525"/>
-          <w:sz w:val="20"/>
-        </w:rPr>
-        <w:t xml:space="preserve">• </w:t>
-      </w:r>
-      <w:r>
-        <w:rPr>
-          <w:rFonts w:ascii="Times New Roman" w:hAnsi="Times New Roman" w:eastAsia="Times New Roman"/>
-          <w:b w:val="0"/>
-          <w:i w:val="0"/>
-          <w:color w:val="252525"/>
-          <w:sz w:val="20"/>
-        </w:rPr>
-        <w:t>Best Presentation Award - ICRAI 2025, Nagoya, Japan.</w:t>
-      </w:r>
-    </w:p>
-    <w:p>
-      <w:pPr>
-        <w:pStyle w:val="CVBullet"/>
-        <w:keepNext w:val="0"/>
-        <w:keepLines w:val="0"/>
-        <w:spacing w:before="0" w:after="54" w:line="264" w:lineRule="auto"/>
-        <w:ind w:left="317" w:hanging="173" w:right="0"/>
-        <w:widowControl/>
-      </w:pPr>
-      <w:r>
-        <w:rPr>
-          <w:rFonts w:ascii="Times New Roman" w:hAnsi="Times New Roman" w:eastAsia="Times New Roman"/>
-          <w:b/>
-          <w:i w:val="0"/>
-          <w:color w:val="252525"/>
-          <w:sz w:val="20"/>
-        </w:rPr>
-        <w:t xml:space="preserve">• </w:t>
-      </w:r>
-      <w:r>
-        <w:rPr>
-          <w:rFonts w:ascii="Times New Roman" w:hAnsi="Times New Roman" w:eastAsia="Times New Roman"/>
-          <w:b w:val="0"/>
-          <w:i w:val="0"/>
-          <w:color w:val="252525"/>
-          <w:sz w:val="20"/>
-        </w:rPr>
-        <w:t>Jiangsu Province Anti-Drug Promotion Ambassador and Outstanding Anti-Drug Youth.</w:t>
+          <w:szCs w:val="21"/>
+        </w:rPr>
+        <w:t xml:space="preserve"> | Mar – May 2025</w:t>
+      </w:r>
+    </w:p>
+    <w:p>
+      <w:pPr>
+        <w:shd w:val="clear" w:fill="auto"/>
+        <w:spacing w:after="45" w:line="247" w:lineRule="auto" w:before="0" w:beforeAutospacing="0" w:afterAutospacing="0"/>
+        <w:jc w:val="left"/>
+        <w:widowControl w:val="1"/>
+        <w:keepLines w:val="1"/>
+      </w:pPr>
+      <w:r>
+        <w:rPr>
+          <w:rFonts w:ascii="Times New Roman" w:hAnsi="Times New Roman" w:cs="Times New Roman"/>
+          <w:b w:val="0"/>
+          <w:i w:val="0"/>
+          <w:color w:val="1F1F1F"/>
+          <w:sz w:val="22"/>
+          <w:szCs w:val="22"/>
+        </w:rPr>
+        <w:t xml:space="preserve">Instructed by Prof. Pietro Liò (University of Cambridge); final grade 97.40 / A+.</w:t>
+      </w:r>
+    </w:p>
+    <w:p>
+      <w:pPr>
+        <w:numPr>
+          <w:ilvl w:val="0"/>
+          <w:numId w:val="3"/>
+        </w:numPr>
+        <w:shd w:val="clear" w:fill="auto"/>
+        <w:spacing w:before="0" w:beforeAutospacing="0" w:after="40" w:afterAutospacing="0" w:line="247" w:lineRule="auto"/>
+        <w:ind w:left="465" w:hanging="360"/>
+        <w:jc w:val="left"/>
+        <w:widowControl w:val="1"/>
+        <w:keepLines w:val="1"/>
+      </w:pPr>
+      <w:r>
+        <w:rPr>
+          <w:rFonts w:ascii="Times New Roman" w:hAnsi="Times New Roman" w:cs="Times New Roman"/>
+          <w:b w:val="0"/>
+          <w:i w:val="0"/>
+          <w:color w:val="1F1F1F"/>
+          <w:sz w:val="22"/>
+          <w:szCs w:val="22"/>
+        </w:rPr>
+        <w:t xml:space="preserve">Best Presentation Award — ICRAI 2025, Nagoya, Japan.</w:t>
+      </w:r>
+    </w:p>
+    <w:p>
+      <w:pPr>
+        <w:numPr>
+          <w:ilvl w:val="0"/>
+          <w:numId w:val="3"/>
+        </w:numPr>
+        <w:shd w:val="clear" w:fill="auto"/>
+        <w:spacing w:before="0" w:beforeAutospacing="0" w:after="40" w:afterAutospacing="0" w:line="247" w:lineRule="auto"/>
+        <w:ind w:left="465" w:hanging="360"/>
+        <w:jc w:val="left"/>
+        <w:widowControl w:val="1"/>
+        <w:keepLines w:val="1"/>
+      </w:pPr>
+      <w:r>
+        <w:rPr>
+          <w:rFonts w:ascii="Times New Roman" w:hAnsi="Times New Roman" w:cs="Times New Roman"/>
+          <w:b w:val="0"/>
+          <w:i w:val="0"/>
+          <w:color w:val="1F1F1F"/>
+          <w:sz w:val="22"/>
+          <w:szCs w:val="22"/>
+        </w:rPr>
+        <w:t xml:space="preserve">Jiangsu Province Anti-Drug Promotion Ambassador and Outstanding Anti-Drug Youth.</w:t>
       </w:r>
     </w:p>
     <w:sectPr>
-      <w:headerReference w:type="default" r:id="rId6"/>
-      <w:footerReference w:type="default" r:id="rId7"/>
-      <w:pgSz w:w="11909" w:h="16834"/>
-      <w:pgMar w:top="878" w:right="965" w:bottom="878" w:left="965" w:header="360" w:footer="360" w:gutter="0"/>
+      <w:pgSz w:w="12240" w:h="15840"/>
+      <w:pgMar w:top="936" w:right="1080" w:bottom="936" w:left="1080" w:header="0" w:footer="720" w:gutter="0"/>
       <w:pgNumType w:start="1"/>
       <w:cols w:space="720" w:num="1"/>
     </w:sectPr>
   </w:body>
 </w:document>
-</file>
-
-<file path=word/footer1.xml><?xml version="1.0" encoding="utf-8"?>
-<w:ftr xmlns:m="http://schemas.openxmlformats.org/officeDocument/2006/math" xmlns:mc="http://schemas.openxmlformats.org/markup-compatibility/2006" xmlns:mo="http://schemas.microsoft.com/office/mac/office/2008/main" xmlns:mv="urn:schemas-microsoft-com:mac:vml" xmlns:o="urn:schemas-microsoft-com:office:office" xmlns:r="http://schemas.openxmlformats.org/officeDocument/2006/relationships" xmlns:v="urn:schemas-microsoft-com:vml" xmlns:w10="urn:schemas-microsoft-com:office:word" xmlns:w14="http://schemas.microsoft.com/office/word/2010/wordml" xmlns:w="http://schemas.openxmlformats.org/wordprocessingml/2006/main" xmlns:wne="http://schemas.microsoft.com/office/word/2006/wordml" xmlns:wp14="http://schemas.microsoft.com/office/word/2010/wordprocessingDrawing" xmlns:wp="http://schemas.openxmlformats.org/drawingml/2006/wordprocessingDrawing" xmlns:wpc="http://schemas.microsoft.com/office/word/2010/wordprocessingCanvas" xmlns:wpg="http://schemas.microsoft.com/office/word/2010/wordprocessingGroup" xmlns:wpi="http://schemas.microsoft.com/office/word/2010/wordprocessingInk" xmlns:wps="http://schemas.microsoft.com/office/word/2010/wordprocessingShape" mc:Ignorable="w14 wp14">
-  <w:p>
-    <w:pPr>
-      <w:pStyle w:val="Footer"/>
-    </w:pPr>
-    <w:r/>
-  </w:p>
-</w:ftr>
-</file>
-
-<file path=word/header1.xml><?xml version="1.0" encoding="utf-8"?>
-<w:hdr xmlns:m="http://schemas.openxmlformats.org/officeDocument/2006/math" xmlns:mc="http://schemas.openxmlformats.org/markup-compatibility/2006" xmlns:mo="http://schemas.microsoft.com/office/mac/office/2008/main" xmlns:mv="urn:schemas-microsoft-com:mac:vml" xmlns:o="urn:schemas-microsoft-com:office:office" xmlns:r="http://schemas.openxmlformats.org/officeDocument/2006/relationships" xmlns:v="urn:schemas-microsoft-com:vml" xmlns:w10="urn:schemas-microsoft-com:office:word" xmlns:w14="http://schemas.microsoft.com/office/word/2010/wordml" xmlns:w="http://schemas.openxmlformats.org/wordprocessingml/2006/main" xmlns:wne="http://schemas.microsoft.com/office/word/2006/wordml" xmlns:wp14="http://schemas.microsoft.com/office/word/2010/wordprocessingDrawing" xmlns:wp="http://schemas.openxmlformats.org/drawingml/2006/wordprocessingDrawing" xmlns:wpc="http://schemas.microsoft.com/office/word/2010/wordprocessingCanvas" xmlns:wpg="http://schemas.microsoft.com/office/word/2010/wordprocessingGroup" xmlns:wpi="http://schemas.microsoft.com/office/word/2010/wordprocessingInk" xmlns:wps="http://schemas.microsoft.com/office/word/2010/wordprocessingShape" mc:Ignorable="w14 wp14">
-  <w:p>
-    <w:pPr>
-      <w:pStyle w:val="Header"/>
-    </w:pPr>
-    <w:r/>
-  </w:p>
-</w:hdr>
 </file>
 
 <file path=word/numbering.xml><?xml version="1.0" encoding="utf-8"?>
@@ -3461,12 +3628,10 @@
     <w:uiPriority w:val="0"/>
     <w:pPr>
       <w:widowControl w:val="0"/>
-      <w:spacing w:after="32" w:line="252" w:lineRule="auto"/>
     </w:pPr>
     <w:rPr>
-      <w:rFonts w:ascii="Times New Roman" w:hAnsi="Times New Roman" w:eastAsia="Times New Roman" w:cs="Arial"/>
-      <w:color w:val="252525"/>
-      <w:sz w:val="20"/>
+      <w:rFonts w:ascii="Arial" w:hAnsi="Arial" w:eastAsia="Arial" w:cs="Arial"/>
+      <w:sz w:val="22"/>
       <w:szCs w:val="22"/>
     </w:rPr>
   </w:style>
@@ -3499,7 +3664,6 @@
     <w:next w:val="1"/>
     <w:uiPriority w:val="0"/>
     <w:pPr>
-      <w:keepNext/>
       <w:pBdr>
         <w:top w:val="none" w:color="auto" w:sz="0" w:space="0"/>
         <w:left w:val="none" w:color="auto" w:sz="0" w:space="0"/>
@@ -3508,14 +3672,12 @@
         <w:between w:val="none" w:color="auto" w:sz="0" w:space="0"/>
       </w:pBdr>
       <w:shd w:val="clear" w:fill="auto"/>
-      <w:spacing w:before="140" w:after="64"/>
+      <w:spacing w:before="225" w:after="225"/>
     </w:pPr>
     <w:rPr>
-      <w:rFonts w:ascii="Times New Roman" w:hAnsi="Times New Roman" w:eastAsia="Times New Roman"/>
       <w:b/>
       <w:bCs/>
-      <w:color w:val="252525"/>
-      <w:sz w:val="24"/>
+      <w:sz w:val="36"/>
       <w:szCs w:val="36"/>
     </w:rPr>
   </w:style>
@@ -3679,29 +3841,6 @@
         <w:right w:w="100" w:type="dxa"/>
       </w:tblCellMar>
     </w:tblPr>
-  </w:style>
-  <w:style w:type="paragraph" w:customStyle="1" w:styleId="CVRole">
-    <w:name w:val="CV Role"/>
-    <w:basedOn w:val="1"/>
-    <w:pPr>
-      <w:keepNext/>
-      <w:spacing w:after="34"/>
-    </w:pPr>
-    <w:rPr>
-      <w:rFonts w:ascii="Times New Roman" w:hAnsi="Times New Roman" w:eastAsia="Times New Roman"/>
-      <w:i/>
-      <w:color w:val="4E4E4E"/>
-      <w:sz w:val="20"/>
-    </w:rPr>
-  </w:style>
-  <w:style w:type="paragraph" w:customStyle="1" w:styleId="CVBullet">
-    <w:name w:val="CV Bullet"/>
-    <w:basedOn w:val="1"/>
-    <w:rPr>
-      <w:rFonts w:ascii="Times New Roman" w:hAnsi="Times New Roman" w:eastAsia="Times New Roman"/>
-      <w:color w:val="252525"/>
-      <w:sz w:val="20"/>
-    </w:rPr>
   </w:style>
 </w:styles>
 </file>

</xml_diff>

<commit_message>
Refresh study project overview, feature hourglass and update CV
</commit_message>
<xml_diff>
--- a/Peixuan_Yang_Academic_CV.docx
+++ b/Peixuan_Yang_Academic_CV.docx
@@ -254,26 +254,6 @@
           <w:szCs w:val="21"/>
         </w:rPr>
         <w:t xml:space="preserve"> | Sep 2024 – Jul 2026</w:t>
-      </w:r>
-    </w:p>
-    <w:p>
-      <w:pPr>
-        <w:shd w:val="clear" w:fill="auto"/>
-        <w:spacing w:after="45" w:line="247" w:lineRule="auto" w:before="0" w:beforeAutospacing="0" w:afterAutospacing="0"/>
-        <w:jc w:val="left"/>
-        <w:widowControl w:val="1"/>
-        <w:keepLines w:val="1"/>
-      </w:pPr>
-      <w:r>
-        <w:rPr>
-          <w:rFonts w:ascii="Times New Roman" w:hAnsi="Times New Roman" w:cs="Times New Roman"/>
-          <w:b w:val="0"/>
-          <w:i w:val="0"/>
-          <w:color w:val="1F1F1F"/>
-          <w:sz w:val="22"/>
-          <w:szCs w:val="22"/>
-        </w:rPr>
-        <w:t xml:space="preserve">University of Liverpool International Education Programme.</w:t>
       </w:r>
     </w:p>
     <w:p>

</xml_diff>